<commit_message>
First complete user interaction draft
</commit_message>
<xml_diff>
--- a/Analysis.docx
+++ b/Analysis.docx
@@ -103,6 +103,13 @@
     </w:p>
     <w:sdt>
       <w:sdtPr>
+        <w:rPr>
+          <w:rFonts w:asciiTheme="minorHAnsi" w:eastAsiaTheme="minorHAnsi" w:hAnsiTheme="minorHAnsi" w:cstheme="minorBidi"/>
+          <w:color w:val="auto"/>
+          <w:sz w:val="24"/>
+          <w:szCs w:val="22"/>
+          <w:lang w:val="en-GB"/>
+        </w:rPr>
         <w:id w:val="-822117104"/>
         <w:docPartObj>
           <w:docPartGallery w:val="Table of Contents"/>
@@ -111,14 +118,9 @@
       </w:sdtPr>
       <w:sdtEndPr>
         <w:rPr>
-          <w:rFonts w:asciiTheme="minorHAnsi" w:eastAsiaTheme="minorHAnsi" w:hAnsiTheme="minorHAnsi" w:cstheme="minorBidi"/>
           <w:b/>
           <w:bCs/>
           <w:noProof/>
-          <w:color w:val="auto"/>
-          <w:sz w:val="24"/>
-          <w:szCs w:val="22"/>
-          <w:lang w:val="en-GB"/>
         </w:rPr>
       </w:sdtEndPr>
       <w:sdtContent>
@@ -152,7 +154,7 @@
           <w:r>
             <w:fldChar w:fldCharType="separate"/>
           </w:r>
-          <w:hyperlink w:anchor="_Toc124005997" w:history="1">
+          <w:hyperlink w:anchor="_Toc124869867" w:history="1">
             <w:r>
               <w:rPr>
                 <w:rStyle w:val="Hyperlink"/>
@@ -179,7 +181,7 @@
                 <w:noProof/>
                 <w:webHidden/>
               </w:rPr>
-              <w:instrText xml:space="preserve"> PAGEREF _Toc124005997 \h </w:instrText>
+              <w:instrText xml:space="preserve"> PAGEREF _Toc124869867 \h </w:instrText>
             </w:r>
             <w:r>
               <w:rPr>
@@ -223,7 +225,7 @@
               <w:lang w:eastAsia="en-GB"/>
             </w:rPr>
           </w:pPr>
-          <w:hyperlink w:anchor="_Toc124005998" w:history="1">
+          <w:hyperlink w:anchor="_Toc124869868" w:history="1">
             <w:r>
               <w:rPr>
                 <w:rStyle w:val="Hyperlink"/>
@@ -250,7 +252,7 @@
                 <w:noProof/>
                 <w:webHidden/>
               </w:rPr>
-              <w:instrText xml:space="preserve"> PAGEREF _Toc124005998 \h </w:instrText>
+              <w:instrText xml:space="preserve"> PAGEREF _Toc124869868 \h </w:instrText>
             </w:r>
             <w:r>
               <w:rPr>
@@ -294,7 +296,7 @@
               <w:lang w:eastAsia="en-GB"/>
             </w:rPr>
           </w:pPr>
-          <w:hyperlink w:anchor="_Toc124005999" w:history="1">
+          <w:hyperlink w:anchor="_Toc124869869" w:history="1">
             <w:r>
               <w:rPr>
                 <w:rStyle w:val="Hyperlink"/>
@@ -321,7 +323,7 @@
                 <w:noProof/>
                 <w:webHidden/>
               </w:rPr>
-              <w:instrText xml:space="preserve"> PAGEREF _Toc124005999 \h </w:instrText>
+              <w:instrText xml:space="preserve"> PAGEREF _Toc124869869 \h </w:instrText>
             </w:r>
             <w:r>
               <w:rPr>
@@ -365,7 +367,7 @@
               <w:lang w:eastAsia="en-GB"/>
             </w:rPr>
           </w:pPr>
-          <w:hyperlink w:anchor="_Toc124006000" w:history="1">
+          <w:hyperlink w:anchor="_Toc124869870" w:history="1">
             <w:r>
               <w:rPr>
                 <w:rStyle w:val="Hyperlink"/>
@@ -392,7 +394,7 @@
                 <w:noProof/>
                 <w:webHidden/>
               </w:rPr>
-              <w:instrText xml:space="preserve"> PAGEREF _Toc124006000 \h </w:instrText>
+              <w:instrText xml:space="preserve"> PAGEREF _Toc124869870 \h </w:instrText>
             </w:r>
             <w:r>
               <w:rPr>
@@ -436,7 +438,7 @@
               <w:lang w:eastAsia="en-GB"/>
             </w:rPr>
           </w:pPr>
-          <w:hyperlink w:anchor="_Toc124006001" w:history="1">
+          <w:hyperlink w:anchor="_Toc124869871" w:history="1">
             <w:r>
               <w:rPr>
                 <w:rStyle w:val="Hyperlink"/>
@@ -463,7 +465,7 @@
                 <w:noProof/>
                 <w:webHidden/>
               </w:rPr>
-              <w:instrText xml:space="preserve"> PAGEREF _Toc124006001 \h </w:instrText>
+              <w:instrText xml:space="preserve"> PAGEREF _Toc124869871 \h </w:instrText>
             </w:r>
             <w:r>
               <w:rPr>
@@ -507,7 +509,7 @@
               <w:lang w:eastAsia="en-GB"/>
             </w:rPr>
           </w:pPr>
-          <w:hyperlink w:anchor="_Toc124006002" w:history="1">
+          <w:hyperlink w:anchor="_Toc124869872" w:history="1">
             <w:r>
               <w:rPr>
                 <w:rStyle w:val="Hyperlink"/>
@@ -534,7 +536,7 @@
                 <w:noProof/>
                 <w:webHidden/>
               </w:rPr>
-              <w:instrText xml:space="preserve"> PAGEREF _Toc124006002 \h </w:instrText>
+              <w:instrText xml:space="preserve"> PAGEREF _Toc124869872 \h </w:instrText>
             </w:r>
             <w:r>
               <w:rPr>
@@ -555,6 +557,432 @@
                 <w:webHidden/>
               </w:rPr>
               <w:t>5</w:t>
+            </w:r>
+            <w:r>
+              <w:rPr>
+                <w:noProof/>
+                <w:webHidden/>
+              </w:rPr>
+              <w:fldChar w:fldCharType="end"/>
+            </w:r>
+          </w:hyperlink>
+        </w:p>
+        <w:p>
+          <w:pPr>
+            <w:pStyle w:val="TOC2"/>
+            <w:tabs>
+              <w:tab w:val="right" w:leader="dot" w:pos="9016"/>
+            </w:tabs>
+            <w:rPr>
+              <w:rFonts w:eastAsiaTheme="minorEastAsia"/>
+              <w:noProof/>
+              <w:sz w:val="22"/>
+              <w:lang w:eastAsia="en-GB"/>
+            </w:rPr>
+          </w:pPr>
+          <w:hyperlink w:anchor="_Toc124869873" w:history="1">
+            <w:r>
+              <w:rPr>
+                <w:rStyle w:val="Hyperlink"/>
+                <w:noProof/>
+              </w:rPr>
+              <w:t>Question 1: What functions of the operating system can you remember right now?</w:t>
+            </w:r>
+            <w:r>
+              <w:rPr>
+                <w:noProof/>
+                <w:webHidden/>
+              </w:rPr>
+              <w:tab/>
+            </w:r>
+            <w:r>
+              <w:rPr>
+                <w:noProof/>
+                <w:webHidden/>
+              </w:rPr>
+              <w:fldChar w:fldCharType="begin"/>
+            </w:r>
+            <w:r>
+              <w:rPr>
+                <w:noProof/>
+                <w:webHidden/>
+              </w:rPr>
+              <w:instrText xml:space="preserve"> PAGEREF _Toc124869873 \h </w:instrText>
+            </w:r>
+            <w:r>
+              <w:rPr>
+                <w:noProof/>
+                <w:webHidden/>
+              </w:rPr>
+            </w:r>
+            <w:r>
+              <w:rPr>
+                <w:noProof/>
+                <w:webHidden/>
+              </w:rPr>
+              <w:fldChar w:fldCharType="separate"/>
+            </w:r>
+            <w:r>
+              <w:rPr>
+                <w:noProof/>
+                <w:webHidden/>
+              </w:rPr>
+              <w:t>5</w:t>
+            </w:r>
+            <w:r>
+              <w:rPr>
+                <w:noProof/>
+                <w:webHidden/>
+              </w:rPr>
+              <w:fldChar w:fldCharType="end"/>
+            </w:r>
+          </w:hyperlink>
+        </w:p>
+        <w:p>
+          <w:pPr>
+            <w:pStyle w:val="TOC2"/>
+            <w:tabs>
+              <w:tab w:val="right" w:leader="dot" w:pos="9016"/>
+            </w:tabs>
+            <w:rPr>
+              <w:rFonts w:eastAsiaTheme="minorEastAsia"/>
+              <w:noProof/>
+              <w:sz w:val="22"/>
+              <w:lang w:eastAsia="en-GB"/>
+            </w:rPr>
+          </w:pPr>
+          <w:hyperlink w:anchor="_Toc124869874" w:history="1">
+            <w:r>
+              <w:rPr>
+                <w:rStyle w:val="Hyperlink"/>
+                <w:noProof/>
+              </w:rPr>
+              <w:t>Question 2: How difficult do you find the topic of the operating system? (1 being very easy, 10 being very difficult)</w:t>
+            </w:r>
+            <w:r>
+              <w:rPr>
+                <w:noProof/>
+                <w:webHidden/>
+              </w:rPr>
+              <w:tab/>
+            </w:r>
+            <w:r>
+              <w:rPr>
+                <w:noProof/>
+                <w:webHidden/>
+              </w:rPr>
+              <w:fldChar w:fldCharType="begin"/>
+            </w:r>
+            <w:r>
+              <w:rPr>
+                <w:noProof/>
+                <w:webHidden/>
+              </w:rPr>
+              <w:instrText xml:space="preserve"> PAGEREF _Toc124869874 \h </w:instrText>
+            </w:r>
+            <w:r>
+              <w:rPr>
+                <w:noProof/>
+                <w:webHidden/>
+              </w:rPr>
+            </w:r>
+            <w:r>
+              <w:rPr>
+                <w:noProof/>
+                <w:webHidden/>
+              </w:rPr>
+              <w:fldChar w:fldCharType="separate"/>
+            </w:r>
+            <w:r>
+              <w:rPr>
+                <w:noProof/>
+                <w:webHidden/>
+              </w:rPr>
+              <w:t>6</w:t>
+            </w:r>
+            <w:r>
+              <w:rPr>
+                <w:noProof/>
+                <w:webHidden/>
+              </w:rPr>
+              <w:fldChar w:fldCharType="end"/>
+            </w:r>
+          </w:hyperlink>
+        </w:p>
+        <w:p>
+          <w:pPr>
+            <w:pStyle w:val="TOC2"/>
+            <w:tabs>
+              <w:tab w:val="right" w:leader="dot" w:pos="9016"/>
+            </w:tabs>
+            <w:rPr>
+              <w:rFonts w:eastAsiaTheme="minorEastAsia"/>
+              <w:noProof/>
+              <w:sz w:val="22"/>
+              <w:lang w:eastAsia="en-GB"/>
+            </w:rPr>
+          </w:pPr>
+          <w:hyperlink w:anchor="_Toc124869875" w:history="1">
+            <w:r>
+              <w:rPr>
+                <w:rStyle w:val="Hyperlink"/>
+                <w:noProof/>
+              </w:rPr>
+              <w:t>Question 3: What do you like about existing revision sources such as Bitesize and Craig 'n' Dave?</w:t>
+            </w:r>
+            <w:r>
+              <w:rPr>
+                <w:noProof/>
+                <w:webHidden/>
+              </w:rPr>
+              <w:tab/>
+            </w:r>
+            <w:r>
+              <w:rPr>
+                <w:noProof/>
+                <w:webHidden/>
+              </w:rPr>
+              <w:fldChar w:fldCharType="begin"/>
+            </w:r>
+            <w:r>
+              <w:rPr>
+                <w:noProof/>
+                <w:webHidden/>
+              </w:rPr>
+              <w:instrText xml:space="preserve"> PAGEREF _Toc124869875 \h </w:instrText>
+            </w:r>
+            <w:r>
+              <w:rPr>
+                <w:noProof/>
+                <w:webHidden/>
+              </w:rPr>
+            </w:r>
+            <w:r>
+              <w:rPr>
+                <w:noProof/>
+                <w:webHidden/>
+              </w:rPr>
+              <w:fldChar w:fldCharType="separate"/>
+            </w:r>
+            <w:r>
+              <w:rPr>
+                <w:noProof/>
+                <w:webHidden/>
+              </w:rPr>
+              <w:t>6</w:t>
+            </w:r>
+            <w:r>
+              <w:rPr>
+                <w:noProof/>
+                <w:webHidden/>
+              </w:rPr>
+              <w:fldChar w:fldCharType="end"/>
+            </w:r>
+          </w:hyperlink>
+        </w:p>
+        <w:p>
+          <w:pPr>
+            <w:pStyle w:val="TOC2"/>
+            <w:tabs>
+              <w:tab w:val="right" w:leader="dot" w:pos="9016"/>
+            </w:tabs>
+            <w:rPr>
+              <w:rFonts w:eastAsiaTheme="minorEastAsia"/>
+              <w:noProof/>
+              <w:sz w:val="22"/>
+              <w:lang w:eastAsia="en-GB"/>
+            </w:rPr>
+          </w:pPr>
+          <w:hyperlink w:anchor="_Toc124869876" w:history="1">
+            <w:r>
+              <w:rPr>
+                <w:rStyle w:val="Hyperlink"/>
+                <w:noProof/>
+              </w:rPr>
+              <w:t>Question 4: What do you dislike about existing revision sources such as Bitesize and Craig 'n' Dave?</w:t>
+            </w:r>
+            <w:r>
+              <w:rPr>
+                <w:noProof/>
+                <w:webHidden/>
+              </w:rPr>
+              <w:tab/>
+            </w:r>
+            <w:r>
+              <w:rPr>
+                <w:noProof/>
+                <w:webHidden/>
+              </w:rPr>
+              <w:fldChar w:fldCharType="begin"/>
+            </w:r>
+            <w:r>
+              <w:rPr>
+                <w:noProof/>
+                <w:webHidden/>
+              </w:rPr>
+              <w:instrText xml:space="preserve"> PAGEREF _Toc124869876 \h </w:instrText>
+            </w:r>
+            <w:r>
+              <w:rPr>
+                <w:noProof/>
+                <w:webHidden/>
+              </w:rPr>
+            </w:r>
+            <w:r>
+              <w:rPr>
+                <w:noProof/>
+                <w:webHidden/>
+              </w:rPr>
+              <w:fldChar w:fldCharType="separate"/>
+            </w:r>
+            <w:r>
+              <w:rPr>
+                <w:noProof/>
+                <w:webHidden/>
+              </w:rPr>
+              <w:t>6</w:t>
+            </w:r>
+            <w:r>
+              <w:rPr>
+                <w:noProof/>
+                <w:webHidden/>
+              </w:rPr>
+              <w:fldChar w:fldCharType="end"/>
+            </w:r>
+          </w:hyperlink>
+        </w:p>
+        <w:p>
+          <w:pPr>
+            <w:pStyle w:val="TOC2"/>
+            <w:tabs>
+              <w:tab w:val="right" w:leader="dot" w:pos="9016"/>
+            </w:tabs>
+            <w:rPr>
+              <w:rFonts w:eastAsiaTheme="minorEastAsia"/>
+              <w:noProof/>
+              <w:sz w:val="22"/>
+              <w:lang w:eastAsia="en-GB"/>
+            </w:rPr>
+          </w:pPr>
+          <w:hyperlink w:anchor="_Toc124869877" w:history="1">
+            <w:r>
+              <w:rPr>
+                <w:rStyle w:val="Hyperlink"/>
+                <w:noProof/>
+              </w:rPr>
+              <w:t>Question 5: What revision methods do you find work the best for you?</w:t>
+            </w:r>
+            <w:r>
+              <w:rPr>
+                <w:noProof/>
+                <w:webHidden/>
+              </w:rPr>
+              <w:tab/>
+            </w:r>
+            <w:r>
+              <w:rPr>
+                <w:noProof/>
+                <w:webHidden/>
+              </w:rPr>
+              <w:fldChar w:fldCharType="begin"/>
+            </w:r>
+            <w:r>
+              <w:rPr>
+                <w:noProof/>
+                <w:webHidden/>
+              </w:rPr>
+              <w:instrText xml:space="preserve"> PAGEREF _Toc124869877 \h </w:instrText>
+            </w:r>
+            <w:r>
+              <w:rPr>
+                <w:noProof/>
+                <w:webHidden/>
+              </w:rPr>
+            </w:r>
+            <w:r>
+              <w:rPr>
+                <w:noProof/>
+                <w:webHidden/>
+              </w:rPr>
+              <w:fldChar w:fldCharType="separate"/>
+            </w:r>
+            <w:r>
+              <w:rPr>
+                <w:noProof/>
+                <w:webHidden/>
+              </w:rPr>
+              <w:t>7</w:t>
+            </w:r>
+            <w:r>
+              <w:rPr>
+                <w:noProof/>
+                <w:webHidden/>
+              </w:rPr>
+              <w:fldChar w:fldCharType="end"/>
+            </w:r>
+          </w:hyperlink>
+        </w:p>
+        <w:p>
+          <w:pPr>
+            <w:pStyle w:val="TOC2"/>
+            <w:tabs>
+              <w:tab w:val="right" w:leader="dot" w:pos="9016"/>
+            </w:tabs>
+            <w:rPr>
+              <w:rFonts w:eastAsiaTheme="minorEastAsia"/>
+              <w:noProof/>
+              <w:sz w:val="22"/>
+              <w:lang w:eastAsia="en-GB"/>
+            </w:rPr>
+          </w:pPr>
+          <w:hyperlink w:anchor="_Toc124869878" w:history="1">
+            <w:r>
+              <w:rPr>
+                <w:rStyle w:val="Hyperlink"/>
+                <w:noProof/>
+              </w:rPr>
+              <w:t>Question 6: Would you like the game to speed up as it goes on?</w:t>
+            </w:r>
+            <w:r>
+              <w:rPr>
+                <w:noProof/>
+                <w:webHidden/>
+              </w:rPr>
+              <w:tab/>
+            </w:r>
+            <w:r>
+              <w:rPr>
+                <w:noProof/>
+                <w:webHidden/>
+              </w:rPr>
+              <w:fldChar w:fldCharType="begin"/>
+            </w:r>
+            <w:r>
+              <w:rPr>
+                <w:noProof/>
+                <w:webHidden/>
+              </w:rPr>
+              <w:instrText xml:space="preserve"> PAGEREF _Toc124869878 \h </w:instrText>
+            </w:r>
+            <w:r>
+              <w:rPr>
+                <w:noProof/>
+                <w:webHidden/>
+              </w:rPr>
+            </w:r>
+            <w:r>
+              <w:rPr>
+                <w:noProof/>
+                <w:webHidden/>
+              </w:rPr>
+              <w:fldChar w:fldCharType="separate"/>
+            </w:r>
+            <w:r>
+              <w:rPr>
+                <w:noProof/>
+                <w:webHidden/>
+              </w:rPr>
+              <w:t>7</w:t>
             </w:r>
             <w:r>
               <w:rPr>
@@ -594,7 +1022,7 @@
       <w:pPr>
         <w:pStyle w:val="Heading1"/>
       </w:pPr>
-      <w:bookmarkStart w:id="0" w:name="_Toc124005997"/>
+      <w:bookmarkStart w:id="0" w:name="_Toc124869867"/>
       <w:r>
         <w:lastRenderedPageBreak/>
         <w:t>Introduction</w:t>
@@ -740,7 +1168,7 @@
       <w:pPr>
         <w:pStyle w:val="Heading1"/>
       </w:pPr>
-      <w:bookmarkStart w:id="1" w:name="_Toc124005998"/>
+      <w:bookmarkStart w:id="1" w:name="_Toc124869868"/>
       <w:r>
         <w:t>Existing Solutions</w:t>
       </w:r>
@@ -755,7 +1183,7 @@
       <w:pPr>
         <w:pStyle w:val="Heading2"/>
       </w:pPr>
-      <w:bookmarkStart w:id="2" w:name="_Toc124005999"/>
+      <w:bookmarkStart w:id="2" w:name="_Toc124869869"/>
       <w:r>
         <w:t>BBC Bitesize</w:t>
       </w:r>
@@ -768,8 +1196,12 @@
         </w:rPr>
       </w:pPr>
       <w:r>
+        <w:rPr>
+          <w:noProof/>
+          <w:lang w:eastAsia="en-GB"/>
+        </w:rPr>
         <w:drawing>
-          <wp:anchor distT="0" distB="0" distL="114300" distR="114300" simplePos="0" relativeHeight="251661312" behindDoc="0" locked="0" layoutInCell="1" allowOverlap="1" wp14:anchorId="09670FBB" wp14:editId="7D69A0F7">
+          <wp:anchor distT="0" distB="0" distL="114300" distR="114300" simplePos="0" relativeHeight="251658241" behindDoc="0" locked="0" layoutInCell="1" allowOverlap="1" wp14:anchorId="09670FBB" wp14:editId="7D69A0F7">
             <wp:simplePos x="0" y="0"/>
             <wp:positionH relativeFrom="column">
               <wp:posOffset>2943225</wp:posOffset>
@@ -800,7 +1232,7 @@
                     <pic:cNvPicPr/>
                   </pic:nvPicPr>
                   <pic:blipFill>
-                    <a:blip r:embed="rId8"/>
+                    <a:blip r:embed="rId9"/>
                     <a:stretch>
                       <a:fillRect/>
                     </a:stretch>
@@ -827,8 +1259,12 @@
         </w:drawing>
       </w:r>
       <w:r>
+        <w:rPr>
+          <w:noProof/>
+          <w:lang w:eastAsia="en-GB"/>
+        </w:rPr>
         <w:drawing>
-          <wp:anchor distT="0" distB="0" distL="114300" distR="114300" simplePos="0" relativeHeight="251659264" behindDoc="0" locked="0" layoutInCell="1" allowOverlap="1" wp14:anchorId="2CFFA0F6" wp14:editId="5DD09606">
+          <wp:anchor distT="0" distB="0" distL="114300" distR="114300" simplePos="0" relativeHeight="251658240" behindDoc="0" locked="0" layoutInCell="1" allowOverlap="1" wp14:anchorId="2CFFA0F6" wp14:editId="5DD09606">
             <wp:simplePos x="0" y="0"/>
             <wp:positionH relativeFrom="column">
               <wp:posOffset>-314325</wp:posOffset>
@@ -859,7 +1295,7 @@
                     <pic:cNvPicPr/>
                   </pic:nvPicPr>
                   <pic:blipFill>
-                    <a:blip r:embed="rId9"/>
+                    <a:blip r:embed="rId10"/>
                     <a:stretch>
                       <a:fillRect/>
                     </a:stretch>
@@ -951,7 +1387,7 @@
           <w:noProof/>
         </w:rPr>
       </w:pPr>
-      <w:bookmarkStart w:id="3" w:name="_Toc124006000"/>
+      <w:bookmarkStart w:id="3" w:name="_Toc124869870"/>
       <w:r>
         <w:rPr>
           <w:noProof/>
@@ -983,8 +1419,12 @@
     </w:p>
     <w:p>
       <w:r>
+        <w:rPr>
+          <w:noProof/>
+          <w:lang w:eastAsia="en-GB"/>
+        </w:rPr>
         <w:drawing>
-          <wp:anchor distT="0" distB="0" distL="114300" distR="114300" simplePos="0" relativeHeight="251663360" behindDoc="0" locked="0" layoutInCell="1" allowOverlap="1" wp14:anchorId="0C68B188" wp14:editId="2EBA0F2B">
+          <wp:anchor distT="0" distB="0" distL="114300" distR="114300" simplePos="0" relativeHeight="251658242" behindDoc="0" locked="0" layoutInCell="1" allowOverlap="1" wp14:anchorId="0C68B188" wp14:editId="2EBA0F2B">
             <wp:simplePos x="0" y="0"/>
             <wp:positionH relativeFrom="column">
               <wp:posOffset>476250</wp:posOffset>
@@ -1015,7 +1455,7 @@
                     <pic:cNvPicPr/>
                   </pic:nvPicPr>
                   <pic:blipFill>
-                    <a:blip r:embed="rId10"/>
+                    <a:blip r:embed="rId11"/>
                     <a:stretch>
                       <a:fillRect/>
                     </a:stretch>
@@ -1091,7 +1531,7 @@
       <w:pPr>
         <w:pStyle w:val="Heading2"/>
       </w:pPr>
-      <w:bookmarkStart w:id="4" w:name="_Toc124006001"/>
+      <w:bookmarkStart w:id="4" w:name="_Toc124869871"/>
       <w:r>
         <w:t>Geeks for Geeks</w:t>
       </w:r>
@@ -1116,9 +1556,11 @@
       <w:r>
         <w:t xml:space="preserve"> the AQA specification. </w:t>
       </w:r>
+      <w:proofErr w:type="gramStart"/>
       <w:r>
         <w:t>Similarly</w:t>
       </w:r>
+      <w:proofErr w:type="gramEnd"/>
       <w:r>
         <w:t xml:space="preserve"> to BBC Bitesize, there are many blocks of somewhat intimidating text</w:t>
       </w:r>
@@ -1140,8 +1582,12 @@
     </w:p>
     <w:p>
       <w:r>
+        <w:rPr>
+          <w:noProof/>
+          <w:lang w:eastAsia="en-GB"/>
+        </w:rPr>
         <w:drawing>
-          <wp:anchor distT="0" distB="0" distL="114300" distR="114300" simplePos="0" relativeHeight="251665408" behindDoc="0" locked="0" layoutInCell="1" allowOverlap="1" wp14:anchorId="0243F1BF" wp14:editId="1ECF0AF1">
+          <wp:anchor distT="0" distB="0" distL="114300" distR="114300" simplePos="0" relativeHeight="251658243" behindDoc="0" locked="0" layoutInCell="1" allowOverlap="1" wp14:anchorId="0243F1BF" wp14:editId="1ECF0AF1">
             <wp:simplePos x="0" y="0"/>
             <wp:positionH relativeFrom="column">
               <wp:posOffset>-38735</wp:posOffset>
@@ -1172,7 +1618,7 @@
                     <pic:cNvPicPr/>
                   </pic:nvPicPr>
                   <pic:blipFill>
-                    <a:blip r:embed="rId11"/>
+                    <a:blip r:embed="rId12"/>
                     <a:stretch>
                       <a:fillRect/>
                     </a:stretch>
@@ -1212,11 +1658,15 @@
       <w:pPr>
         <w:pStyle w:val="Heading1"/>
       </w:pPr>
-      <w:bookmarkStart w:id="5" w:name="_Toc124006002"/>
-      <w:r>
+      <w:bookmarkStart w:id="5" w:name="_Toc124869872"/>
+      <w:r>
+        <w:rPr>
+          <w:noProof/>
+          <w:lang w:eastAsia="en-GB"/>
+        </w:rPr>
         <w:lastRenderedPageBreak/>
         <w:drawing>
-          <wp:anchor distT="0" distB="0" distL="114300" distR="114300" simplePos="0" relativeHeight="251667456" behindDoc="0" locked="0" layoutInCell="1" allowOverlap="1" wp14:anchorId="43F6738F" wp14:editId="5A9BC761">
+          <wp:anchor distT="0" distB="0" distL="114300" distR="114300" simplePos="0" relativeHeight="251658244" behindDoc="0" locked="0" layoutInCell="1" allowOverlap="1" wp14:anchorId="43F6738F" wp14:editId="5A9BC761">
             <wp:simplePos x="0" y="0"/>
             <wp:positionH relativeFrom="column">
               <wp:posOffset>-190500</wp:posOffset>
@@ -1247,7 +1697,7 @@
                     <pic:cNvPicPr/>
                   </pic:nvPicPr>
                   <pic:blipFill>
-                    <a:blip r:embed="rId12"/>
+                    <a:blip r:embed="rId13"/>
                     <a:stretch>
                       <a:fillRect/>
                     </a:stretch>
@@ -1292,13 +1742,13 @@
         <w:t xml:space="preserve">I distributed </w:t>
       </w:r>
       <w:r>
-        <w:t xml:space="preserve">a survey to </w:t>
-      </w:r>
-      <w:r>
-        <w:t xml:space="preserve">students in my class, </w:t>
-      </w:r>
-      <w:r>
-        <w:t xml:space="preserve">students in </w:t>
+        <w:t>a survey t</w:t>
+      </w:r>
+      <w:r>
+        <w:t>o stude</w:t>
+      </w:r>
+      <w:r>
+        <w:t xml:space="preserve">nts in </w:t>
       </w:r>
       <w:r>
         <w:t xml:space="preserve">a </w:t>
@@ -1307,17 +1757,1249 @@
         <w:t xml:space="preserve">year </w:t>
       </w:r>
       <w:r>
-        <w:t xml:space="preserve">11 class at my school and an online forum primarily used for </w:t>
-      </w:r>
-      <w:r>
-        <w:t>revision.</w:t>
+        <w:t>11 class at my school</w:t>
+      </w:r>
+      <w:r>
+        <w:t>.</w:t>
+      </w:r>
+    </w:p>
+    <w:p>
+      <w:pPr>
+        <w:rPr>
+          <w:i/>
+          <w:iCs/>
+        </w:rPr>
+      </w:pPr>
+      <w:r>
+        <w:rPr>
+          <w:i/>
+          <w:iCs/>
+        </w:rPr>
+        <w:t xml:space="preserve">Note: Percentages stated in this section may appear inconsistent as they </w:t>
+      </w:r>
+      <w:r>
+        <w:rPr>
+          <w:i/>
+          <w:iCs/>
+        </w:rPr>
+        <w:t>refer to the number of students who answered each question which can change (</w:t>
+      </w:r>
+      <w:proofErr w:type="spellStart"/>
+      <w:r>
+        <w:rPr>
+          <w:i/>
+          <w:iCs/>
+        </w:rPr>
+        <w:t>eg.</w:t>
+      </w:r>
+      <w:proofErr w:type="spellEnd"/>
+      <w:r>
+        <w:rPr>
+          <w:i/>
+          <w:iCs/>
+        </w:rPr>
+        <w:t xml:space="preserve"> students who did not want a score were not asked about an online leaderboard)</w:t>
+      </w:r>
+    </w:p>
+    <w:p>
+      <w:pPr>
+        <w:pStyle w:val="Heading2"/>
+      </w:pPr>
+      <w:bookmarkStart w:id="6" w:name="_Toc124869873"/>
+      <w:r>
+        <w:t>Question 1: What functions of the operating system can you remember right now?</w:t>
+      </w:r>
+      <w:bookmarkEnd w:id="6"/>
+    </w:p>
+    <w:p>
+      <w:r>
+        <w:t xml:space="preserve">Ten (40%) of the respondents to this question </w:t>
+      </w:r>
+      <w:r>
+        <w:t xml:space="preserve">said words to the effect of none. This shows me that this is a good area of the GCSE syllabus to base my project around as even in a year 11 class a large amount of them </w:t>
+      </w:r>
+      <w:proofErr w:type="gramStart"/>
+      <w:r>
+        <w:t>are</w:t>
+      </w:r>
+      <w:proofErr w:type="gramEnd"/>
+      <w:r>
+        <w:t xml:space="preserve"> not confident with the topic.</w:t>
+      </w:r>
+    </w:p>
+    <w:p>
+      <w:r>
+        <w:t>Of the people that could remember the functions, common answers included memory management, the fetch execute cycle and providing a platform for software to run on. There were also references to computer security. T</w:t>
+      </w:r>
+      <w:r>
+        <w:t>his will help me decide which subtopics to focus on within my game.</w:t>
+      </w:r>
+    </w:p>
+    <w:p>
+      <w:pPr>
+        <w:pStyle w:val="Heading2"/>
+      </w:pPr>
+      <w:bookmarkStart w:id="7" w:name="_Toc124869874"/>
+      <w:r>
+        <w:lastRenderedPageBreak/>
+        <w:t>Question 2:</w:t>
+      </w:r>
+      <w:r>
+        <w:t xml:space="preserve"> </w:t>
+      </w:r>
+      <w:r>
+        <w:t>How difficult do you find the topic of the operating system? (1 being very easy, 10 being very difficult)</w:t>
+      </w:r>
+      <w:bookmarkEnd w:id="7"/>
+    </w:p>
+    <w:p>
+      <w:r>
+        <w:rPr>
+          <w:noProof/>
+          <w:lang w:eastAsia="en-GB"/>
+        </w:rPr>
+        <w:drawing>
+          <wp:inline distT="0" distB="0" distL="0" distR="0" wp14:anchorId="2F9D6384" wp14:editId="4D7B0779">
+            <wp:extent cx="5731510" cy="2878455"/>
+            <wp:effectExtent l="0" t="0" r="2540" b="0"/>
+            <wp:docPr id="9" name="Picture 9"/>
+            <wp:cNvGraphicFramePr>
+              <a:graphicFrameLocks xmlns:a="http://schemas.openxmlformats.org/drawingml/2006/main" noChangeAspect="1"/>
+            </wp:cNvGraphicFramePr>
+            <a:graphic xmlns:a="http://schemas.openxmlformats.org/drawingml/2006/main">
+              <a:graphicData uri="http://schemas.openxmlformats.org/drawingml/2006/picture">
+                <pic:pic xmlns:pic="http://schemas.openxmlformats.org/drawingml/2006/picture">
+                  <pic:nvPicPr>
+                    <pic:cNvPr id="1" name=""/>
+                    <pic:cNvPicPr/>
+                  </pic:nvPicPr>
+                  <pic:blipFill>
+                    <a:blip r:embed="rId14"/>
+                    <a:stretch>
+                      <a:fillRect/>
+                    </a:stretch>
+                  </pic:blipFill>
+                  <pic:spPr>
+                    <a:xfrm>
+                      <a:off x="0" y="0"/>
+                      <a:ext cx="5731510" cy="2878455"/>
+                    </a:xfrm>
+                    <a:prstGeom prst="rect">
+                      <a:avLst/>
+                    </a:prstGeom>
+                  </pic:spPr>
+                </pic:pic>
+              </a:graphicData>
+            </a:graphic>
+          </wp:inline>
+        </w:drawing>
+      </w:r>
+    </w:p>
+    <w:p>
+      <w:r>
+        <w:t>The average answer for this question was seven, further confirming that many students struggle with this topic.</w:t>
+      </w:r>
+      <w:r>
+        <w:t xml:space="preserve"> Additionally, the lowest response was a four (only given by two students) whilst the highest response was ten, the second most common response.</w:t>
+      </w:r>
+    </w:p>
+    <w:p/>
+    <w:p>
+      <w:pPr>
+        <w:pStyle w:val="Heading2"/>
+      </w:pPr>
+      <w:bookmarkStart w:id="8" w:name="_Toc124869875"/>
+      <w:r>
+        <w:t xml:space="preserve">Question 3: </w:t>
+      </w:r>
+      <w:r>
+        <w:t>What do you like about existing revision sources such as Bitesize and Craig 'n' Dave?</w:t>
+      </w:r>
+      <w:bookmarkEnd w:id="8"/>
+    </w:p>
+    <w:p>
+      <w:r>
+        <w:t>T</w:t>
+      </w:r>
+      <w:r>
+        <w:t>he sentiment received from this question revealed that many students liked the level of organisation and structure that these websites provided. Due to my project being focused on one topic</w:t>
+      </w:r>
+      <w:r>
+        <w:t>,</w:t>
+      </w:r>
+      <w:r>
+        <w:t xml:space="preserve"> this feedback does not apply to me however I may be able to group sub-topics in the learning mode (see </w:t>
+      </w:r>
+      <w:hyperlink w:anchor="_Question_10:_Would" w:history="1">
+        <w:r>
+          <w:rPr>
+            <w:rStyle w:val="Hyperlink"/>
+          </w:rPr>
+          <w:t>Que</w:t>
+        </w:r>
+        <w:r>
+          <w:rPr>
+            <w:rStyle w:val="Hyperlink"/>
+          </w:rPr>
+          <w:t>s</w:t>
+        </w:r>
+        <w:r>
+          <w:rPr>
+            <w:rStyle w:val="Hyperlink"/>
+          </w:rPr>
+          <w:t>tion 10</w:t>
+        </w:r>
+      </w:hyperlink>
+      <w:r>
+        <w:t>)</w:t>
+      </w:r>
+      <w:r>
+        <w:t>.</w:t>
+      </w:r>
+    </w:p>
+    <w:p>
+      <w:r>
+        <w:t xml:space="preserve">They also liked the fact that it was easy to use </w:t>
+      </w:r>
+      <w:r>
+        <w:t xml:space="preserve">and </w:t>
+      </w:r>
+      <w:proofErr w:type="gramStart"/>
+      <w:r>
+        <w:t>low</w:t>
+      </w:r>
+      <w:r>
+        <w:t>-</w:t>
+      </w:r>
+      <w:r>
+        <w:t>friction</w:t>
+      </w:r>
+      <w:proofErr w:type="gramEnd"/>
+      <w:r>
+        <w:t>. I feel that this will be an important part of my project as no one will want to use a revision tool that is too difficult to start using, especially in a high-stress situation such as before an exam.</w:t>
+      </w:r>
+    </w:p>
+    <w:p>
+      <w:pPr>
+        <w:pStyle w:val="Heading2"/>
+      </w:pPr>
+      <w:bookmarkStart w:id="9" w:name="_Toc124869876"/>
+      <w:r>
+        <w:t xml:space="preserve">Question 4: </w:t>
+      </w:r>
+      <w:r>
+        <w:t>What do you dislike about existing revision sources such as Bitesize and Craig 'n' Dave?</w:t>
+      </w:r>
+      <w:bookmarkEnd w:id="9"/>
+    </w:p>
+    <w:p>
+      <w:r>
+        <w:t xml:space="preserve">Thirteen (52%) of the respondents described the </w:t>
+      </w:r>
+      <w:r>
+        <w:t>existing revision sources as boring and unengaging, with some saying that they are too wordy to easily digest the information. I plan to combat this by providing a wide range of game functionality to keep the user engaged in what they are doing.</w:t>
+      </w:r>
+    </w:p>
+    <w:p>
+      <w:r>
+        <w:t xml:space="preserve">One respondent also said that </w:t>
+      </w:r>
+      <w:r>
+        <w:t>existing solutions</w:t>
+      </w:r>
+      <w:r>
+        <w:t xml:space="preserve"> are slow at getting </w:t>
+      </w:r>
+      <w:r>
+        <w:t>to the main point of the content they are teaching. I will ensure that my project displays the key points in an easy</w:t>
+      </w:r>
+      <w:r>
+        <w:t>-to-</w:t>
+      </w:r>
+      <w:r>
+        <w:t>access manner, rather than hide them within large blocks of text.</w:t>
+      </w:r>
+    </w:p>
+    <w:p>
+      <w:pPr>
+        <w:pStyle w:val="Heading2"/>
+      </w:pPr>
+      <w:bookmarkStart w:id="10" w:name="_Toc124869877"/>
+      <w:r>
+        <w:lastRenderedPageBreak/>
+        <w:t xml:space="preserve">Question 5: </w:t>
+      </w:r>
+      <w:r>
+        <w:t>What revision methods do you find work the best for you?</w:t>
+      </w:r>
+      <w:bookmarkEnd w:id="10"/>
+    </w:p>
+    <w:p>
+      <w:r>
+        <w:rPr>
+          <w:noProof/>
+          <w:lang w:eastAsia="en-GB"/>
+        </w:rPr>
+        <w:drawing>
+          <wp:inline distT="0" distB="0" distL="0" distR="0" wp14:anchorId="39150941" wp14:editId="1C075BCD">
+            <wp:extent cx="5674360" cy="3244850"/>
+            <wp:effectExtent l="0" t="0" r="2540" b="0"/>
+            <wp:docPr id="10" name="Picture 10"/>
+            <wp:cNvGraphicFramePr>
+              <a:graphicFrameLocks xmlns:a="http://schemas.openxmlformats.org/drawingml/2006/main" noChangeAspect="1"/>
+            </wp:cNvGraphicFramePr>
+            <a:graphic xmlns:a="http://schemas.openxmlformats.org/drawingml/2006/main">
+              <a:graphicData uri="http://schemas.openxmlformats.org/drawingml/2006/picture">
+                <pic:pic xmlns:pic="http://schemas.openxmlformats.org/drawingml/2006/picture">
+                  <pic:nvPicPr>
+                    <pic:cNvPr id="1" name=""/>
+                    <pic:cNvPicPr/>
+                  </pic:nvPicPr>
+                  <pic:blipFill rotWithShape="1">
+                    <a:blip r:embed="rId15"/>
+                    <a:srcRect l="997"/>
+                    <a:stretch/>
+                  </pic:blipFill>
+                  <pic:spPr bwMode="auto">
+                    <a:xfrm>
+                      <a:off x="0" y="0"/>
+                      <a:ext cx="5674360" cy="3244850"/>
+                    </a:xfrm>
+                    <a:prstGeom prst="rect">
+                      <a:avLst/>
+                    </a:prstGeom>
+                    <a:ln>
+                      <a:noFill/>
+                    </a:ln>
+                    <a:extLst>
+                      <a:ext uri="{53640926-AAD7-44D8-BBD7-CCE9431645EC}">
+                        <a14:shadowObscured xmlns:a14="http://schemas.microsoft.com/office/drawing/2010/main"/>
+                      </a:ext>
+                    </a:extLst>
+                  </pic:spPr>
+                </pic:pic>
+              </a:graphicData>
+            </a:graphic>
+          </wp:inline>
+        </w:drawing>
+      </w:r>
+    </w:p>
+    <w:p>
+      <w:r>
+        <w:t xml:space="preserve">Twelve (48%) of the respondents said that educational games help them to revise effectively. This confirms that a large </w:t>
+      </w:r>
+      <w:r>
+        <w:t>number</w:t>
+      </w:r>
+      <w:r>
+        <w:t xml:space="preserve"> of students will find my project a practical way to revise for the operating system topic. Interestingly, not many said that interactive quizzes were helpful</w:t>
+      </w:r>
+      <w:r>
+        <w:t xml:space="preserve">, something that I was </w:t>
+      </w:r>
+      <w:r>
+        <w:t>expecting to be more popular. Despite this</w:t>
+      </w:r>
+      <w:r>
+        <w:t>,</w:t>
+      </w:r>
+      <w:r>
+        <w:t xml:space="preserve"> I will probably still include some during the highly requested learning mode (see </w:t>
+      </w:r>
+      <w:hyperlink w:anchor="_Question_10:_Would" w:history="1">
+        <w:r>
+          <w:rPr>
+            <w:rStyle w:val="Hyperlink"/>
+          </w:rPr>
+          <w:t>Question 10</w:t>
+        </w:r>
+      </w:hyperlink>
+      <w:r>
+        <w:t xml:space="preserve">) as I believe testing knowledge is an important part of </w:t>
+      </w:r>
+      <w:r>
+        <w:t>learning,</w:t>
+      </w:r>
+    </w:p>
+    <w:p>
+      <w:pPr>
+        <w:pStyle w:val="Heading2"/>
+      </w:pPr>
+      <w:bookmarkStart w:id="11" w:name="_Toc124869878"/>
+      <w:bookmarkStart w:id="12" w:name="_Question_6:_Would"/>
+      <w:bookmarkEnd w:id="12"/>
+      <w:r>
+        <w:t xml:space="preserve">Question 6: </w:t>
+      </w:r>
+      <w:r>
+        <w:t>Would you like the game to speed up as it goes on?</w:t>
+      </w:r>
+      <w:bookmarkEnd w:id="11"/>
+    </w:p>
+    <w:p>
+      <w:r>
+        <w:drawing>
+          <wp:anchor distT="0" distB="0" distL="114300" distR="114300" simplePos="0" relativeHeight="251658245" behindDoc="0" locked="0" layoutInCell="1" allowOverlap="1" wp14:anchorId="3861BA68" wp14:editId="1169C71B">
+            <wp:simplePos x="0" y="0"/>
+            <wp:positionH relativeFrom="column">
+              <wp:posOffset>2105025</wp:posOffset>
+            </wp:positionH>
+            <wp:positionV relativeFrom="paragraph">
+              <wp:posOffset>22225</wp:posOffset>
+            </wp:positionV>
+            <wp:extent cx="1847850" cy="2493645"/>
+            <wp:effectExtent l="0" t="0" r="0" b="1905"/>
+            <wp:wrapTopAndBottom/>
+            <wp:docPr id="5" name="Picture 5" descr="Chart, pie chart&#10;&#10;Description automatically generated"/>
+            <wp:cNvGraphicFramePr>
+              <a:graphicFrameLocks xmlns:a="http://schemas.openxmlformats.org/drawingml/2006/main" noChangeAspect="1"/>
+            </wp:cNvGraphicFramePr>
+            <a:graphic xmlns:a="http://schemas.openxmlformats.org/drawingml/2006/main">
+              <a:graphicData uri="http://schemas.openxmlformats.org/drawingml/2006/picture">
+                <pic:pic xmlns:pic="http://schemas.openxmlformats.org/drawingml/2006/picture">
+                  <pic:nvPicPr>
+                    <pic:cNvPr id="5" name="Picture 5" descr="Chart, pie chart&#10;&#10;Description automatically generated"/>
+                    <pic:cNvPicPr/>
+                  </pic:nvPicPr>
+                  <pic:blipFill rotWithShape="1">
+                    <a:blip r:embed="rId16">
+                      <a:extLst>
+                        <a:ext uri="{28A0092B-C50C-407E-A947-70E740481C1C}">
+                          <a14:useLocalDpi xmlns:a14="http://schemas.microsoft.com/office/drawing/2010/main" val="0"/>
+                        </a:ext>
+                      </a:extLst>
+                    </a:blip>
+                    <a:srcRect l="28666" r="28223"/>
+                    <a:stretch/>
+                  </pic:blipFill>
+                  <pic:spPr bwMode="auto">
+                    <a:xfrm>
+                      <a:off x="0" y="0"/>
+                      <a:ext cx="1847850" cy="2493645"/>
+                    </a:xfrm>
+                    <a:prstGeom prst="rect">
+                      <a:avLst/>
+                    </a:prstGeom>
+                    <a:ln>
+                      <a:noFill/>
+                    </a:ln>
+                    <a:extLst>
+                      <a:ext uri="{53640926-AAD7-44D8-BBD7-CCE9431645EC}">
+                        <a14:shadowObscured xmlns:a14="http://schemas.microsoft.com/office/drawing/2010/main"/>
+                      </a:ext>
+                    </a:extLst>
+                  </pic:spPr>
+                </pic:pic>
+              </a:graphicData>
+            </a:graphic>
+            <wp14:sizeRelH relativeFrom="margin">
+              <wp14:pctWidth>0</wp14:pctWidth>
+            </wp14:sizeRelH>
+          </wp:anchor>
+        </w:drawing>
+      </w:r>
+      <w:r>
+        <w:t xml:space="preserve">The results for this question were fairly conclusive with only </w:t>
+      </w:r>
+      <w:r>
+        <w:t>three</w:t>
+      </w:r>
+      <w:r>
+        <w:t xml:space="preserve"> (</w:t>
+      </w:r>
+      <w:r>
+        <w:t>12%) students saying</w:t>
+      </w:r>
+      <w:r>
+        <w:t xml:space="preserve"> </w:t>
+      </w:r>
+      <w:r>
+        <w:t xml:space="preserve">that they would </w:t>
+      </w:r>
+      <w:r>
+        <w:t xml:space="preserve">not like the game </w:t>
+      </w:r>
+      <w:r>
+        <w:t>to speed up as the game progresses</w:t>
+      </w:r>
+      <w:r>
+        <w:t xml:space="preserve">. I will therefore ensure that </w:t>
+      </w:r>
+      <w:r>
+        <w:t xml:space="preserve">this is a key feature of the gameplay </w:t>
+      </w:r>
+      <w:r>
+        <w:t>by increasing the rate at which events for the player to handle occur.</w:t>
+      </w:r>
+    </w:p>
+    <w:p>
+      <w:pPr>
+        <w:pStyle w:val="Heading2"/>
+      </w:pPr>
+      <w:r>
+        <w:lastRenderedPageBreak/>
+        <w:t xml:space="preserve">Question 7: </w:t>
+      </w:r>
+      <w:r>
+        <w:t>Would you like to be provided with a final score at the end of the game?</w:t>
+      </w:r>
+    </w:p>
+    <w:p>
+      <w:r>
+        <w:drawing>
+          <wp:anchor distT="0" distB="0" distL="114300" distR="114300" simplePos="0" relativeHeight="251662341" behindDoc="0" locked="0" layoutInCell="1" allowOverlap="1" wp14:anchorId="15916523" wp14:editId="7AB0E9FE">
+            <wp:simplePos x="0" y="0"/>
+            <wp:positionH relativeFrom="column">
+              <wp:posOffset>1847850</wp:posOffset>
+            </wp:positionH>
+            <wp:positionV relativeFrom="paragraph">
+              <wp:posOffset>4144645</wp:posOffset>
+            </wp:positionV>
+            <wp:extent cx="2733675" cy="2552700"/>
+            <wp:effectExtent l="0" t="0" r="9525" b="0"/>
+            <wp:wrapTopAndBottom/>
+            <wp:docPr id="8" name="Picture 8" descr="Chart, pie chart&#10;&#10;Description automatically generated"/>
+            <wp:cNvGraphicFramePr>
+              <a:graphicFrameLocks xmlns:a="http://schemas.openxmlformats.org/drawingml/2006/main" noChangeAspect="1"/>
+            </wp:cNvGraphicFramePr>
+            <a:graphic xmlns:a="http://schemas.openxmlformats.org/drawingml/2006/main">
+              <a:graphicData uri="http://schemas.openxmlformats.org/drawingml/2006/picture">
+                <pic:pic xmlns:pic="http://schemas.openxmlformats.org/drawingml/2006/picture">
+                  <pic:nvPicPr>
+                    <pic:cNvPr id="8" name="Picture 8" descr="Chart, pie chart&#10;&#10;Description automatically generated"/>
+                    <pic:cNvPicPr/>
+                  </pic:nvPicPr>
+                  <pic:blipFill>
+                    <a:blip r:embed="rId17"/>
+                    <a:stretch>
+                      <a:fillRect/>
+                    </a:stretch>
+                  </pic:blipFill>
+                  <pic:spPr>
+                    <a:xfrm>
+                      <a:off x="0" y="0"/>
+                      <a:ext cx="2733675" cy="2552700"/>
+                    </a:xfrm>
+                    <a:prstGeom prst="rect">
+                      <a:avLst/>
+                    </a:prstGeom>
+                  </pic:spPr>
+                </pic:pic>
+              </a:graphicData>
+            </a:graphic>
+          </wp:anchor>
+        </w:drawing>
+      </w:r>
+      <w:r>
+        <w:drawing>
+          <wp:anchor distT="0" distB="0" distL="114300" distR="114300" simplePos="0" relativeHeight="251660293" behindDoc="0" locked="0" layoutInCell="1" allowOverlap="1" wp14:anchorId="5D923468" wp14:editId="50B4B046">
+            <wp:simplePos x="0" y="0"/>
+            <wp:positionH relativeFrom="column">
+              <wp:posOffset>1762125</wp:posOffset>
+            </wp:positionH>
+            <wp:positionV relativeFrom="paragraph">
+              <wp:posOffset>39370</wp:posOffset>
+            </wp:positionV>
+            <wp:extent cx="2409825" cy="2571750"/>
+            <wp:effectExtent l="0" t="0" r="9525" b="0"/>
+            <wp:wrapTopAndBottom/>
+            <wp:docPr id="7" name="Picture 7" descr="Chart, pie chart&#10;&#10;Description automatically generated"/>
+            <wp:cNvGraphicFramePr>
+              <a:graphicFrameLocks xmlns:a="http://schemas.openxmlformats.org/drawingml/2006/main" noChangeAspect="1"/>
+            </wp:cNvGraphicFramePr>
+            <a:graphic xmlns:a="http://schemas.openxmlformats.org/drawingml/2006/main">
+              <a:graphicData uri="http://schemas.openxmlformats.org/drawingml/2006/picture">
+                <pic:pic xmlns:pic="http://schemas.openxmlformats.org/drawingml/2006/picture">
+                  <pic:nvPicPr>
+                    <pic:cNvPr id="7" name="Picture 7" descr="Chart, pie chart&#10;&#10;Description automatically generated"/>
+                    <pic:cNvPicPr/>
+                  </pic:nvPicPr>
+                  <pic:blipFill>
+                    <a:blip r:embed="rId18"/>
+                    <a:stretch>
+                      <a:fillRect/>
+                    </a:stretch>
+                  </pic:blipFill>
+                  <pic:spPr>
+                    <a:xfrm>
+                      <a:off x="0" y="0"/>
+                      <a:ext cx="2409825" cy="2571750"/>
+                    </a:xfrm>
+                    <a:prstGeom prst="rect">
+                      <a:avLst/>
+                    </a:prstGeom>
+                  </pic:spPr>
+                </pic:pic>
+              </a:graphicData>
+            </a:graphic>
+          </wp:anchor>
+        </w:drawing>
+      </w:r>
+      <w:r>
+        <w:t>Again,</w:t>
+      </w:r>
+      <w:r>
+        <w:t xml:space="preserve"> this question provided</w:t>
+      </w:r>
+      <w:r>
+        <w:t xml:space="preserve"> a very conclusive response </w:t>
+      </w:r>
+      <w:r>
+        <w:t>with only one (</w:t>
+      </w:r>
+      <w:r>
+        <w:t xml:space="preserve">4%) student </w:t>
+      </w:r>
+      <w:r>
+        <w:t xml:space="preserve">saying that this is not a feature that they would want. I will have to </w:t>
+      </w:r>
+      <w:r>
+        <w:t>take into consideration</w:t>
+      </w:r>
+      <w:r>
+        <w:t xml:space="preserve"> whether the score should be purely based o</w:t>
+      </w:r>
+      <w:r>
+        <w:t>n</w:t>
+      </w:r>
+      <w:r>
+        <w:t xml:space="preserve"> </w:t>
+      </w:r>
+      <w:r>
+        <w:t xml:space="preserve">time survived or if </w:t>
+      </w:r>
+      <w:r>
+        <w:t xml:space="preserve">other </w:t>
+      </w:r>
+      <w:r>
+        <w:t xml:space="preserve">factors such as difficulty and average frustration level </w:t>
+      </w:r>
+      <w:r>
+        <w:t>should have an impact on the player’s final score.</w:t>
+      </w:r>
+      <w:r>
+        <w:t xml:space="preserve"> I could also </w:t>
+      </w:r>
+      <w:r>
+        <w:t xml:space="preserve">consider a handicap feature that allows students from different year groups to compete against each other </w:t>
+      </w:r>
+      <w:r>
+        <w:t>fairly</w:t>
+      </w:r>
+      <w:r>
+        <w:t>.</w:t>
+      </w:r>
+    </w:p>
+    <w:p>
+      <w:pPr>
+        <w:pStyle w:val="Heading2"/>
+      </w:pPr>
+      <w:bookmarkStart w:id="13" w:name="_Question_8:_Would"/>
+      <w:bookmarkEnd w:id="13"/>
+      <w:r>
+        <w:t xml:space="preserve">Question 8: </w:t>
+      </w:r>
+      <w:r>
+        <w:t>Would you like an online lea</w:t>
+      </w:r>
+      <w:r>
+        <w:t>d</w:t>
+      </w:r>
+      <w:r>
+        <w:t>erboard?</w:t>
+      </w:r>
+    </w:p>
+    <w:p>
+      <w:r>
+        <w:t xml:space="preserve">Whilst slightly more divided than some previous questions, </w:t>
+      </w:r>
+      <w:r>
+        <w:t xml:space="preserve">most students agreed that they would like an online leaderboard. I </w:t>
+      </w:r>
+      <w:r>
+        <w:t xml:space="preserve">think that this feature would add an incentive to use the revision tool as </w:t>
+      </w:r>
+      <w:r>
+        <w:t xml:space="preserve">it would allow </w:t>
+      </w:r>
+      <w:r>
+        <w:t xml:space="preserve">students </w:t>
+      </w:r>
+      <w:r>
+        <w:t xml:space="preserve">to directly compete with each other to try and get the highest score. I have personally </w:t>
+      </w:r>
+      <w:r>
+        <w:t>seen and experienced that this can be quite strong motivation for students to use a revision tool.</w:t>
+      </w:r>
+    </w:p>
+    <w:p>
+      <w:pPr>
+        <w:pStyle w:val="Heading2"/>
+      </w:pPr>
+      <w:r>
+        <w:lastRenderedPageBreak/>
+        <w:drawing>
+          <wp:anchor distT="0" distB="0" distL="114300" distR="114300" simplePos="0" relativeHeight="251664389" behindDoc="0" locked="0" layoutInCell="1" allowOverlap="1" wp14:anchorId="476BD938" wp14:editId="7657031E">
+            <wp:simplePos x="0" y="0"/>
+            <wp:positionH relativeFrom="column">
+              <wp:posOffset>28575</wp:posOffset>
+            </wp:positionH>
+            <wp:positionV relativeFrom="paragraph">
+              <wp:posOffset>278130</wp:posOffset>
+            </wp:positionV>
+            <wp:extent cx="5731510" cy="2059940"/>
+            <wp:effectExtent l="0" t="0" r="2540" b="0"/>
+            <wp:wrapTopAndBottom/>
+            <wp:docPr id="12" name="Picture 12" descr="Chart, bar chart&#10;&#10;Description automatically generated"/>
+            <wp:cNvGraphicFramePr>
+              <a:graphicFrameLocks xmlns:a="http://schemas.openxmlformats.org/drawingml/2006/main" noChangeAspect="1"/>
+            </wp:cNvGraphicFramePr>
+            <a:graphic xmlns:a="http://schemas.openxmlformats.org/drawingml/2006/main">
+              <a:graphicData uri="http://schemas.openxmlformats.org/drawingml/2006/picture">
+                <pic:pic xmlns:pic="http://schemas.openxmlformats.org/drawingml/2006/picture">
+                  <pic:nvPicPr>
+                    <pic:cNvPr id="12" name="Picture 12" descr="Chart, bar chart&#10;&#10;Description automatically generated"/>
+                    <pic:cNvPicPr/>
+                  </pic:nvPicPr>
+                  <pic:blipFill>
+                    <a:blip r:embed="rId19"/>
+                    <a:stretch>
+                      <a:fillRect/>
+                    </a:stretch>
+                  </pic:blipFill>
+                  <pic:spPr>
+                    <a:xfrm>
+                      <a:off x="0" y="0"/>
+                      <a:ext cx="5731510" cy="2059940"/>
+                    </a:xfrm>
+                    <a:prstGeom prst="rect">
+                      <a:avLst/>
+                    </a:prstGeom>
+                  </pic:spPr>
+                </pic:pic>
+              </a:graphicData>
+            </a:graphic>
+          </wp:anchor>
+        </w:drawing>
+      </w:r>
+      <w:r>
+        <w:t>Question 9:</w:t>
+      </w:r>
+      <w:r>
+        <w:t xml:space="preserve"> </w:t>
+      </w:r>
+      <w:r>
+        <w:t>What filtering options would you like on an online leaderboard?</w:t>
+      </w:r>
+    </w:p>
+    <w:p>
+      <w:r>
+        <w:t>There was a fairly even spread of responses to this question, indicating that</w:t>
+      </w:r>
+      <w:r>
+        <w:t xml:space="preserve"> it would be worthwhile to implement all of the mentioned filters, and potentially even a customisable option. Thi</w:t>
+      </w:r>
+      <w:r>
+        <w:t>s will add some complexity in that it will require me to store the time of each recorded score.</w:t>
+      </w:r>
+      <w:r>
+        <w:t xml:space="preserve"> Additionally, ten (</w:t>
+      </w:r>
+      <w:r>
+        <w:t>50%)</w:t>
+      </w:r>
+      <w:r>
+        <w:t xml:space="preserve"> </w:t>
+      </w:r>
+      <w:r>
+        <w:t xml:space="preserve">students wanted to be able to filter </w:t>
+      </w:r>
+      <w:r>
+        <w:t xml:space="preserve">the leaderboard based on whether it was a GCSE or A-Level student that submitted it. I will probably implement this by having two separate leaderboards for </w:t>
+      </w:r>
+      <w:r>
+        <w:t>GCSE and A-Level students.</w:t>
+      </w:r>
+    </w:p>
+    <w:p>
+      <w:pPr>
+        <w:pStyle w:val="Heading2"/>
+      </w:pPr>
+      <w:bookmarkStart w:id="14" w:name="_Question_10:_Would"/>
+      <w:bookmarkEnd w:id="14"/>
+      <w:r>
+        <w:drawing>
+          <wp:anchor distT="0" distB="0" distL="114300" distR="114300" simplePos="0" relativeHeight="251666437" behindDoc="0" locked="0" layoutInCell="1" allowOverlap="1" wp14:anchorId="70F81776" wp14:editId="51C3DD1F">
+            <wp:simplePos x="0" y="0"/>
+            <wp:positionH relativeFrom="column">
+              <wp:posOffset>2066925</wp:posOffset>
+            </wp:positionH>
+            <wp:positionV relativeFrom="paragraph">
+              <wp:posOffset>241935</wp:posOffset>
+            </wp:positionV>
+            <wp:extent cx="2066925" cy="2562225"/>
+            <wp:effectExtent l="0" t="0" r="9525" b="9525"/>
+            <wp:wrapTopAndBottom/>
+            <wp:docPr id="13" name="Picture 13" descr="Chart, pie chart&#10;&#10;Description automatically generated"/>
+            <wp:cNvGraphicFramePr>
+              <a:graphicFrameLocks xmlns:a="http://schemas.openxmlformats.org/drawingml/2006/main" noChangeAspect="1"/>
+            </wp:cNvGraphicFramePr>
+            <a:graphic xmlns:a="http://schemas.openxmlformats.org/drawingml/2006/main">
+              <a:graphicData uri="http://schemas.openxmlformats.org/drawingml/2006/picture">
+                <pic:pic xmlns:pic="http://schemas.openxmlformats.org/drawingml/2006/picture">
+                  <pic:nvPicPr>
+                    <pic:cNvPr id="13" name="Picture 13" descr="Chart, pie chart&#10;&#10;Description automatically generated"/>
+                    <pic:cNvPicPr/>
+                  </pic:nvPicPr>
+                  <pic:blipFill>
+                    <a:blip r:embed="rId20"/>
+                    <a:stretch>
+                      <a:fillRect/>
+                    </a:stretch>
+                  </pic:blipFill>
+                  <pic:spPr>
+                    <a:xfrm>
+                      <a:off x="0" y="0"/>
+                      <a:ext cx="2066925" cy="2562225"/>
+                    </a:xfrm>
+                    <a:prstGeom prst="rect">
+                      <a:avLst/>
+                    </a:prstGeom>
+                  </pic:spPr>
+                </pic:pic>
+              </a:graphicData>
+            </a:graphic>
+          </wp:anchor>
+        </w:drawing>
+      </w:r>
+      <w:r>
+        <w:t>Question 10: Would you use a learning mode?</w:t>
+      </w:r>
+    </w:p>
+    <w:p>
+      <w:r>
+        <w:t xml:space="preserve">With only one (4%) student answering no to this question it is clear that this is a feature I should place </w:t>
+      </w:r>
+      <w:r>
+        <w:t xml:space="preserve">some real emphasis on within my final project. I believe that this will add some legitimacy to </w:t>
+      </w:r>
+      <w:r>
+        <w:t>my project</w:t>
+      </w:r>
+      <w:r>
+        <w:t>'</w:t>
+      </w:r>
+      <w:r>
+        <w:t xml:space="preserve">s claim as not just a game </w:t>
+      </w:r>
+      <w:r>
+        <w:t>but a revision tool that can legitimately help people revise for their exams.</w:t>
+      </w:r>
+    </w:p>
+    <w:p>
+      <w:pPr>
+        <w:pStyle w:val="Heading2"/>
+      </w:pPr>
+      <w:bookmarkStart w:id="15" w:name="_Question_11:_Would"/>
+      <w:bookmarkEnd w:id="15"/>
+      <w:r>
+        <w:lastRenderedPageBreak/>
+        <w:drawing>
+          <wp:anchor distT="0" distB="0" distL="114300" distR="114300" simplePos="0" relativeHeight="251668485" behindDoc="0" locked="0" layoutInCell="1" allowOverlap="1" wp14:anchorId="0F373910" wp14:editId="501186B5">
+            <wp:simplePos x="0" y="0"/>
+            <wp:positionH relativeFrom="column">
+              <wp:posOffset>1990725</wp:posOffset>
+            </wp:positionH>
+            <wp:positionV relativeFrom="paragraph">
+              <wp:posOffset>247015</wp:posOffset>
+            </wp:positionV>
+            <wp:extent cx="1990725" cy="2581275"/>
+            <wp:effectExtent l="0" t="0" r="9525" b="9525"/>
+            <wp:wrapTopAndBottom/>
+            <wp:docPr id="15" name="Picture 15" descr="Chart, pie chart&#10;&#10;Description automatically generated"/>
+            <wp:cNvGraphicFramePr>
+              <a:graphicFrameLocks xmlns:a="http://schemas.openxmlformats.org/drawingml/2006/main" noChangeAspect="1"/>
+            </wp:cNvGraphicFramePr>
+            <a:graphic xmlns:a="http://schemas.openxmlformats.org/drawingml/2006/main">
+              <a:graphicData uri="http://schemas.openxmlformats.org/drawingml/2006/picture">
+                <pic:pic xmlns:pic="http://schemas.openxmlformats.org/drawingml/2006/picture">
+                  <pic:nvPicPr>
+                    <pic:cNvPr id="15" name="Picture 15" descr="Chart, pie chart&#10;&#10;Description automatically generated"/>
+                    <pic:cNvPicPr/>
+                  </pic:nvPicPr>
+                  <pic:blipFill>
+                    <a:blip r:embed="rId21"/>
+                    <a:stretch>
+                      <a:fillRect/>
+                    </a:stretch>
+                  </pic:blipFill>
+                  <pic:spPr>
+                    <a:xfrm>
+                      <a:off x="0" y="0"/>
+                      <a:ext cx="1990725" cy="2581275"/>
+                    </a:xfrm>
+                    <a:prstGeom prst="rect">
+                      <a:avLst/>
+                    </a:prstGeom>
+                  </pic:spPr>
+                </pic:pic>
+              </a:graphicData>
+            </a:graphic>
+          </wp:anchor>
+        </w:drawing>
+      </w:r>
+      <w:r>
+        <w:t xml:space="preserve">Question 11: </w:t>
+      </w:r>
+      <w:r>
+        <w:t>Would you use a zen mode?</w:t>
+      </w:r>
+    </w:p>
+    <w:p>
+      <w:r>
+        <w:t xml:space="preserve">This question was very divisive with </w:t>
+      </w:r>
+      <w:r>
+        <w:t xml:space="preserve">thirteen (52%) of students saying that they would use a zen mode. </w:t>
+      </w:r>
+      <w:r>
+        <w:t xml:space="preserve">I suspect that there is a chance that some of the respondents </w:t>
+      </w:r>
+      <w:r>
+        <w:t>did not understand what I meant by zen mode (a</w:t>
+      </w:r>
+      <w:r>
+        <w:t>n endless</w:t>
+      </w:r>
+      <w:r>
+        <w:t xml:space="preserve"> mode where you can just keep </w:t>
+      </w:r>
+      <w:r>
+        <w:t xml:space="preserve">playing </w:t>
+      </w:r>
+      <w:r>
+        <w:t>regardless of the “frustration level”)</w:t>
+      </w:r>
+      <w:r>
+        <w:t xml:space="preserve">. I think that this would be a valuable </w:t>
+      </w:r>
+      <w:r>
+        <w:t xml:space="preserve">feature for someone who just wants to revise the topic without having to </w:t>
+      </w:r>
+      <w:r>
+        <w:t xml:space="preserve">worry about </w:t>
+      </w:r>
+      <w:hyperlink w:anchor="_Question_6:_Would" w:history="1">
+        <w:r>
+          <w:rPr>
+            <w:rStyle w:val="Hyperlink"/>
+          </w:rPr>
+          <w:t>the difficulty increasing</w:t>
+        </w:r>
+      </w:hyperlink>
+      <w:r>
+        <w:t xml:space="preserve"> as the game progresses</w:t>
+      </w:r>
+      <w:r>
+        <w:t xml:space="preserve">. It also theoretically shouldn’t be too difficult to implement </w:t>
+      </w:r>
+      <w:r>
+        <w:t xml:space="preserve">as I could just remove the check for </w:t>
+      </w:r>
+      <w:r>
+        <w:t>the game</w:t>
+      </w:r>
+      <w:r>
+        <w:t>-</w:t>
+      </w:r>
+      <w:r>
+        <w:t xml:space="preserve">over </w:t>
+      </w:r>
+      <w:r>
+        <w:t>event</w:t>
+      </w:r>
+      <w:r>
+        <w:t xml:space="preserve"> if zen mode is active.</w:t>
+      </w:r>
+    </w:p>
+    <w:p>
+      <w:pPr>
+        <w:pStyle w:val="Heading2"/>
+      </w:pPr>
+      <w:r>
+        <w:drawing>
+          <wp:anchor distT="0" distB="0" distL="114300" distR="114300" simplePos="0" relativeHeight="251670533" behindDoc="0" locked="0" layoutInCell="1" allowOverlap="1" wp14:anchorId="385D0DF2" wp14:editId="7D4A4FE8">
+            <wp:simplePos x="0" y="0"/>
+            <wp:positionH relativeFrom="column">
+              <wp:posOffset>1990725</wp:posOffset>
+            </wp:positionH>
+            <wp:positionV relativeFrom="paragraph">
+              <wp:posOffset>255905</wp:posOffset>
+            </wp:positionV>
+            <wp:extent cx="2333625" cy="2638425"/>
+            <wp:effectExtent l="0" t="0" r="9525" b="9525"/>
+            <wp:wrapTopAndBottom/>
+            <wp:docPr id="16" name="Picture 16" descr="Chart, pie chart&#10;&#10;Description automatically generated"/>
+            <wp:cNvGraphicFramePr>
+              <a:graphicFrameLocks xmlns:a="http://schemas.openxmlformats.org/drawingml/2006/main" noChangeAspect="1"/>
+            </wp:cNvGraphicFramePr>
+            <a:graphic xmlns:a="http://schemas.openxmlformats.org/drawingml/2006/main">
+              <a:graphicData uri="http://schemas.openxmlformats.org/drawingml/2006/picture">
+                <pic:pic xmlns:pic="http://schemas.openxmlformats.org/drawingml/2006/picture">
+                  <pic:nvPicPr>
+                    <pic:cNvPr id="16" name="Picture 16" descr="Chart, pie chart&#10;&#10;Description automatically generated"/>
+                    <pic:cNvPicPr/>
+                  </pic:nvPicPr>
+                  <pic:blipFill>
+                    <a:blip r:embed="rId22"/>
+                    <a:stretch>
+                      <a:fillRect/>
+                    </a:stretch>
+                  </pic:blipFill>
+                  <pic:spPr>
+                    <a:xfrm>
+                      <a:off x="0" y="0"/>
+                      <a:ext cx="2333625" cy="2638425"/>
+                    </a:xfrm>
+                    <a:prstGeom prst="rect">
+                      <a:avLst/>
+                    </a:prstGeom>
+                  </pic:spPr>
+                </pic:pic>
+              </a:graphicData>
+            </a:graphic>
+          </wp:anchor>
+        </w:drawing>
+      </w:r>
+      <w:r>
+        <w:t xml:space="preserve">Question 12: </w:t>
+      </w:r>
+      <w:r>
+        <w:t>Do you prefer fast or slow-paced games?</w:t>
+      </w:r>
+    </w:p>
+    <w:p>
+      <w:r>
+        <w:t xml:space="preserve">With twenty-one (84%) students </w:t>
+      </w:r>
+      <w:r>
+        <w:t xml:space="preserve">this reaffirms my decision to </w:t>
+      </w:r>
+      <w:hyperlink w:anchor="_Question_6:_Would" w:history="1">
+        <w:r>
+          <w:rPr>
+            <w:rStyle w:val="Hyperlink"/>
+          </w:rPr>
+          <w:t>Question 6</w:t>
+        </w:r>
+      </w:hyperlink>
+      <w:r>
+        <w:t xml:space="preserve">. Additionally, those who prefer </w:t>
+      </w:r>
+      <w:r>
+        <w:t xml:space="preserve">a slower game can use the </w:t>
+      </w:r>
+      <w:hyperlink w:anchor="_Question_11:_Would" w:history="1">
+        <w:r>
+          <w:rPr>
+            <w:rStyle w:val="Hyperlink"/>
+          </w:rPr>
+          <w:t>zen mode</w:t>
+        </w:r>
+      </w:hyperlink>
+      <w:r>
+        <w:t>.</w:t>
+      </w:r>
+    </w:p>
+    <w:p>
+      <w:pPr>
+        <w:pStyle w:val="Heading2"/>
+      </w:pPr>
+      <w:r>
+        <w:lastRenderedPageBreak/>
+        <w:drawing>
+          <wp:anchor distT="0" distB="0" distL="114300" distR="114300" simplePos="0" relativeHeight="251672581" behindDoc="0" locked="0" layoutInCell="1" allowOverlap="1" wp14:anchorId="04959112" wp14:editId="50842CCD">
+            <wp:simplePos x="0" y="0"/>
+            <wp:positionH relativeFrom="column">
+              <wp:posOffset>1520041</wp:posOffset>
+            </wp:positionH>
+            <wp:positionV relativeFrom="paragraph">
+              <wp:posOffset>275112</wp:posOffset>
+            </wp:positionV>
+            <wp:extent cx="3057525" cy="2609850"/>
+            <wp:effectExtent l="0" t="0" r="9525" b="0"/>
+            <wp:wrapTopAndBottom/>
+            <wp:docPr id="17" name="Picture 17" descr="Chart, pie chart&#10;&#10;Description automatically generated"/>
+            <wp:cNvGraphicFramePr>
+              <a:graphicFrameLocks xmlns:a="http://schemas.openxmlformats.org/drawingml/2006/main" noChangeAspect="1"/>
+            </wp:cNvGraphicFramePr>
+            <a:graphic xmlns:a="http://schemas.openxmlformats.org/drawingml/2006/main">
+              <a:graphicData uri="http://schemas.openxmlformats.org/drawingml/2006/picture">
+                <pic:pic xmlns:pic="http://schemas.openxmlformats.org/drawingml/2006/picture">
+                  <pic:nvPicPr>
+                    <pic:cNvPr id="17" name="Picture 17" descr="Chart, pie chart&#10;&#10;Description automatically generated"/>
+                    <pic:cNvPicPr/>
+                  </pic:nvPicPr>
+                  <pic:blipFill>
+                    <a:blip r:embed="rId23"/>
+                    <a:stretch>
+                      <a:fillRect/>
+                    </a:stretch>
+                  </pic:blipFill>
+                  <pic:spPr>
+                    <a:xfrm>
+                      <a:off x="0" y="0"/>
+                      <a:ext cx="3057525" cy="2609850"/>
+                    </a:xfrm>
+                    <a:prstGeom prst="rect">
+                      <a:avLst/>
+                    </a:prstGeom>
+                  </pic:spPr>
+                </pic:pic>
+              </a:graphicData>
+            </a:graphic>
+          </wp:anchor>
+        </w:drawing>
+      </w:r>
+      <w:r>
+        <w:t xml:space="preserve">Question 13: </w:t>
+      </w:r>
+      <w:r>
+        <w:t>What control scheme would you prefer?</w:t>
+      </w:r>
+    </w:p>
+    <w:p>
+      <w:r>
+        <w:t>With twenty-one (</w:t>
+      </w:r>
+      <w:r>
+        <w:t xml:space="preserve">84%) of students saying keyboard and mouse, this </w:t>
+      </w:r>
+      <w:r>
+        <w:t xml:space="preserve">is </w:t>
+      </w:r>
+      <w:r>
+        <w:t xml:space="preserve">clearly the most popular opinion. </w:t>
+      </w:r>
+      <w:r>
+        <w:t xml:space="preserve">It would not be practical for me to implement options </w:t>
+      </w:r>
+      <w:r>
+        <w:t xml:space="preserve">as </w:t>
+      </w:r>
+      <w:r>
+        <w:t xml:space="preserve">this would add a lot of </w:t>
+      </w:r>
+      <w:r>
+        <w:t>difficult</w:t>
+      </w:r>
+      <w:r>
+        <w:t>ies</w:t>
+      </w:r>
+      <w:r>
+        <w:t xml:space="preserve"> and require a lot of time without adding much technical complexity to the </w:t>
+      </w:r>
+      <w:r>
+        <w:t xml:space="preserve">project. I do feel however, that due to the nature of the game that the majority of the inputs will be performed using the mouse with only </w:t>
+      </w:r>
+      <w:r>
+        <w:t>some requiring the keyboard.</w:t>
+      </w:r>
+    </w:p>
+    <w:p>
+      <w:pPr>
+        <w:pStyle w:val="Heading2"/>
+      </w:pPr>
+      <w:r>
+        <w:t>Question 14</w:t>
+      </w:r>
+      <w:r>
+        <w:t>: How many minutes should the average game last?</w:t>
+      </w:r>
+      <w:r>
+        <w:t xml:space="preserve"> </w:t>
+      </w:r>
+    </w:p>
+    <w:p>
+      <w:r>
+        <w:t>After removing anomalous and unrealistic responses</w:t>
+      </w:r>
+      <w:r>
+        <w:t xml:space="preserve">, the mean of the responses was 8.3 minutes. I will keep this in mind throughout the </w:t>
+      </w:r>
+      <w:r>
+        <w:t xml:space="preserve">development process, especially when </w:t>
+      </w:r>
+      <w:r>
+        <w:t xml:space="preserve">calibrating the </w:t>
+      </w:r>
+      <w:hyperlink w:anchor="_Question_6:_Would" w:history="1">
+        <w:r>
+          <w:rPr>
+            <w:rStyle w:val="Hyperlink"/>
+          </w:rPr>
+          <w:t>difficulty ramping</w:t>
+        </w:r>
+      </w:hyperlink>
+      <w:r>
+        <w:t>.</w:t>
+      </w:r>
+    </w:p>
+    <w:p>
+      <w:pPr>
+        <w:pStyle w:val="Heading2"/>
+      </w:pPr>
+      <w:r>
+        <w:t>Question 15: Any other comments?</w:t>
+      </w:r>
+    </w:p>
+    <w:p>
+      <w:r>
+        <w:t xml:space="preserve">The two main suggestions received here were multiplayer capability and </w:t>
+      </w:r>
+      <w:r>
+        <w:t xml:space="preserve">having to deal with malicious devices/software attempting to sabotage the computer. </w:t>
+      </w:r>
+      <w:r>
+        <w:t xml:space="preserve">I like the idea of defending against malware and will definitely consider it when formulating a list of </w:t>
+      </w:r>
+      <w:r>
+        <w:t xml:space="preserve">tasks that the player will have to complete. </w:t>
+      </w:r>
+    </w:p>
+    <w:p>
+      <w:r>
+        <w:t xml:space="preserve">Multiplayer </w:t>
+      </w:r>
+      <w:r>
+        <w:t>features</w:t>
+      </w:r>
+      <w:r>
+        <w:t xml:space="preserve"> will add a lot of complexity to my project and </w:t>
+      </w:r>
+      <w:r>
+        <w:t xml:space="preserve">showcase my programming capabilities. </w:t>
+      </w:r>
+      <w:r>
+        <w:t xml:space="preserve">Despite it being a duelling mode specifically that was requested, it is more likely to be a coop mode as duelling someone could be achieved by comparing scores on the </w:t>
+      </w:r>
+      <w:hyperlink w:anchor="_Question_8:_Would" w:history="1">
+        <w:r>
+          <w:rPr>
+            <w:rStyle w:val="Hyperlink"/>
+          </w:rPr>
+          <w:t>online leaderboard</w:t>
+        </w:r>
+      </w:hyperlink>
+      <w:r>
+        <w:t>.</w:t>
       </w:r>
     </w:p>
     <w:sectPr>
-      <w:headerReference w:type="default" r:id="rId13"/>
-      <w:footerReference w:type="default" r:id="rId14"/>
-      <w:headerReference w:type="first" r:id="rId15"/>
-      <w:footerReference w:type="first" r:id="rId16"/>
+      <w:headerReference w:type="default" r:id="rId24"/>
+      <w:footerReference w:type="default" r:id="rId25"/>
+      <w:headerReference w:type="first" r:id="rId26"/>
+      <w:footerReference w:type="first" r:id="rId27"/>
       <w:pgSz w:w="11906" w:h="16838"/>
       <w:pgMar w:top="1440" w:right="1440" w:bottom="1440" w:left="1440" w:header="708" w:footer="708" w:gutter="0"/>
       <w:pgNumType w:start="1"/>
@@ -1349,6 +3031,13 @@
       <w:r>
         <w:continuationSeparator/>
       </w:r>
+    </w:p>
+  </w:endnote>
+  <w:endnote w:type="continuationNotice" w:id="1">
+    <w:p>
+      <w:pPr>
+        <w:spacing w:after="0" w:line="240" w:lineRule="auto"/>
+      </w:pPr>
     </w:p>
   </w:endnote>
 </w:endnotes>
@@ -1388,7 +3077,7 @@
           <w:rPr>
             <w:noProof/>
           </w:rPr>
-          <w:t>2</w:t>
+          <w:t>7</w:t>
         </w:r>
         <w:r>
           <w:rPr>
@@ -1441,7 +3130,7 @@
           <w:rPr>
             <w:noProof/>
           </w:rPr>
-          <w:t>2</w:t>
+          <w:t>1</w:t>
         </w:r>
         <w:r>
           <w:rPr>
@@ -1480,6 +3169,13 @@
       <w:r>
         <w:continuationSeparator/>
       </w:r>
+    </w:p>
+  </w:footnote>
+  <w:footnote w:type="continuationNotice" w:id="1">
+    <w:p>
+      <w:pPr>
+        <w:spacing w:after="0" w:line="240" w:lineRule="auto"/>
+      </w:pPr>
     </w:p>
   </w:footnote>
 </w:footnotes>
@@ -1550,6 +3246,10 @@
     </w:pPr>
   </w:p>
 </w:hdr>
+</file>
+
+<file path=word/numbering.xml><?xml version="1.0" encoding="utf-8"?>
+<w:numbering xmlns:wpc="http://schemas.microsoft.com/office/word/2010/wordprocessingCanvas" xmlns:cx="http://schemas.microsoft.com/office/drawing/2014/chartex" xmlns:cx1="http://schemas.microsoft.com/office/drawing/2015/9/8/chartex" xmlns:cx2="http://schemas.microsoft.com/office/drawing/2015/10/21/chartex" xmlns:cx3="http://schemas.microsoft.com/office/drawing/2016/5/9/chartex" xmlns:cx4="http://schemas.microsoft.com/office/drawing/2016/5/10/chartex" xmlns:cx5="http://schemas.microsoft.com/office/drawing/2016/5/11/chartex" xmlns:cx6="http://schemas.microsoft.com/office/drawing/2016/5/12/chartex" xmlns:cx7="http://schemas.microsoft.com/office/drawing/2016/5/13/chartex" xmlns:cx8="http://schemas.microsoft.com/office/drawing/2016/5/14/chartex" xmlns:mc="http://schemas.openxmlformats.org/markup-compatibility/2006" xmlns:aink="http://schemas.microsoft.com/office/drawing/2016/ink" xmlns:am3d="http://schemas.microsoft.com/office/drawing/2017/model3d" xmlns:o="urn:schemas-microsoft-com:office:office" xmlns:oel="http://schemas.microsoft.com/office/2019/extlst" xmlns:r="http://schemas.openxmlformats.org/officeDocument/2006/relationships" xmlns:m="http://schemas.openxmlformats.org/officeDocument/2006/math" xmlns:v="urn:schemas-microsoft-com:vml" xmlns:wp14="http://schemas.microsoft.com/office/word/2010/wordprocessingDrawing" xmlns:wp="http://schemas.openxmlformats.org/drawingml/2006/wordprocessingDrawing" xmlns:w10="urn:schemas-microsoft-com:office:word" xmlns:w="http://schemas.openxmlformats.org/wordprocessingml/2006/main" xmlns:w14="http://schemas.microsoft.com/office/word/2010/wordml" xmlns:w15="http://schemas.microsoft.com/office/word/2012/wordml" xmlns:w16cex="http://schemas.microsoft.com/office/word/2018/wordml/cex" xmlns:w16cid="http://schemas.microsoft.com/office/word/2016/wordml/cid" xmlns:w16="http://schemas.microsoft.com/office/word/2018/wordml" xmlns:w16sdtdh="http://schemas.microsoft.com/office/word/2020/wordml/sdtdatahash" xmlns:w16se="http://schemas.microsoft.com/office/word/2015/wordml/symex" xmlns:wpg="http://schemas.microsoft.com/office/word/2010/wordprocessingGroup" xmlns:wpi="http://schemas.microsoft.com/office/word/2010/wordprocessingInk" xmlns:wne="http://schemas.microsoft.com/office/word/2006/wordml" xmlns:wps="http://schemas.microsoft.com/office/word/2010/wordprocessingShape" mc:Ignorable="w14 w15 w16se w16cid w16 w16cex w16sdtdh wp14"/>
 </file>
 
 <file path=word/styles.xml><?xml version="1.0" encoding="utf-8"?>
@@ -1675,7 +3375,6 @@
     <w:lsdException w:name="HTML Sample" w:semiHidden="1" w:unhideWhenUsed="1"/>
     <w:lsdException w:name="HTML Typewriter" w:semiHidden="1" w:unhideWhenUsed="1"/>
     <w:lsdException w:name="HTML Variable" w:semiHidden="1" w:unhideWhenUsed="1"/>
-    <w:lsdException w:name="Normal Table" w:semiHidden="1" w:unhideWhenUsed="1"/>
     <w:lsdException w:name="annotation subject" w:semiHidden="1" w:unhideWhenUsed="1"/>
     <w:lsdException w:name="No List" w:semiHidden="1" w:unhideWhenUsed="1"/>
     <w:lsdException w:name="Outline List 1" w:semiHidden="1" w:unhideWhenUsed="1"/>
@@ -1718,11 +3417,8 @@
     <w:lsdException w:name="Table Contemporary" w:semiHidden="1" w:unhideWhenUsed="1"/>
     <w:lsdException w:name="Table Elegant" w:semiHidden="1" w:unhideWhenUsed="1"/>
     <w:lsdException w:name="Table Professional" w:semiHidden="1" w:unhideWhenUsed="1"/>
-    <w:lsdException w:name="Table Subtle 1" w:semiHidden="1" w:unhideWhenUsed="1"/>
     <w:lsdException w:name="Table Subtle 2" w:semiHidden="1" w:unhideWhenUsed="1"/>
     <w:lsdException w:name="Table Web 1" w:semiHidden="1" w:unhideWhenUsed="1"/>
-    <w:lsdException w:name="Table Web 2" w:semiHidden="1" w:unhideWhenUsed="1"/>
-    <w:lsdException w:name="Table Web 3" w:semiHidden="1" w:unhideWhenUsed="1"/>
     <w:lsdException w:name="Balloon Text" w:semiHidden="1" w:unhideWhenUsed="1"/>
     <w:lsdException w:name="Table Grid" w:uiPriority="39"/>
     <w:lsdException w:name="Table Theme" w:semiHidden="1" w:unhideWhenUsed="1"/>
@@ -1998,6 +3694,27 @@
       <w:szCs w:val="26"/>
     </w:rPr>
   </w:style>
+  <w:style w:type="paragraph" w:styleId="Heading3">
+    <w:name w:val="heading 3"/>
+    <w:basedOn w:val="Normal"/>
+    <w:next w:val="Normal"/>
+    <w:link w:val="Heading3Char"/>
+    <w:uiPriority w:val="9"/>
+    <w:unhideWhenUsed/>
+    <w:qFormat/>
+    <w:rsid w:val="00C24644"/>
+    <w:pPr>
+      <w:keepNext/>
+      <w:keepLines/>
+      <w:spacing w:before="40" w:after="0"/>
+      <w:outlineLvl w:val="2"/>
+    </w:pPr>
+    <w:rPr>
+      <w:rFonts w:asciiTheme="majorHAnsi" w:eastAsiaTheme="majorEastAsia" w:hAnsiTheme="majorHAnsi" w:cstheme="majorBidi"/>
+      <w:color w:val="1F3763" w:themeColor="accent1" w:themeShade="7F"/>
+      <w:szCs w:val="24"/>
+    </w:rPr>
+  </w:style>
   <w:style w:type="character" w:default="1" w:styleId="DefaultParagraphFont">
     <w:name w:val="Default Paragraph Font"/>
     <w:uiPriority w:val="1"/>
@@ -2212,6 +3929,56 @@
     <w:rPr>
       <w:rFonts w:eastAsiaTheme="minorEastAsia"/>
       <w:lang w:val="en-US"/>
+    </w:rPr>
+  </w:style>
+  <w:style w:type="character" w:customStyle="1" w:styleId="Heading3Char">
+    <w:name w:val="Heading 3 Char"/>
+    <w:basedOn w:val="DefaultParagraphFont"/>
+    <w:link w:val="Heading3"/>
+    <w:uiPriority w:val="9"/>
+    <w:rsid w:val="00C24644"/>
+    <w:rPr>
+      <w:rFonts w:asciiTheme="majorHAnsi" w:eastAsiaTheme="majorEastAsia" w:hAnsiTheme="majorHAnsi" w:cstheme="majorBidi"/>
+      <w:color w:val="1F3763" w:themeColor="accent1" w:themeShade="7F"/>
+      <w:sz w:val="24"/>
+      <w:szCs w:val="24"/>
+    </w:rPr>
+  </w:style>
+  <w:style w:type="paragraph" w:styleId="TOC3">
+    <w:name w:val="toc 3"/>
+    <w:basedOn w:val="Normal"/>
+    <w:next w:val="Normal"/>
+    <w:autoRedefine/>
+    <w:uiPriority w:val="39"/>
+    <w:unhideWhenUsed/>
+    <w:rsid w:val="00C24644"/>
+    <w:pPr>
+      <w:spacing w:after="100"/>
+      <w:ind w:left="480"/>
+    </w:pPr>
+  </w:style>
+  <w:style w:type="character" w:styleId="UnresolvedMention">
+    <w:name w:val="Unresolved Mention"/>
+    <w:basedOn w:val="DefaultParagraphFont"/>
+    <w:uiPriority w:val="99"/>
+    <w:semiHidden/>
+    <w:unhideWhenUsed/>
+    <w:rsid w:val="00210D7F"/>
+    <w:rPr>
+      <w:color w:val="605E5C"/>
+      <w:shd w:val="clear" w:color="auto" w:fill="E1DFDD"/>
+    </w:rPr>
+  </w:style>
+  <w:style w:type="character" w:styleId="FollowedHyperlink">
+    <w:name w:val="FollowedHyperlink"/>
+    <w:basedOn w:val="DefaultParagraphFont"/>
+    <w:uiPriority w:val="99"/>
+    <w:semiHidden/>
+    <w:unhideWhenUsed/>
+    <w:rsid w:val="00210D7F"/>
+    <w:rPr>
+      <w:color w:val="954F72" w:themeColor="followedHyperlink"/>
+      <w:u w:val="single"/>
     </w:rPr>
   </w:style>
 </w:styles>
@@ -2536,7 +4303,7 @@
 </file>
 
 <file path=customXml/itemProps2.xml><?xml version="1.0" encoding="utf-8"?>
-<ds:datastoreItem xmlns:ds="http://schemas.openxmlformats.org/officeDocument/2006/customXml" ds:itemID="{FF6F4A35-C32A-4A99-B47C-7CB672693F9E}">
+<ds:datastoreItem xmlns:ds="http://schemas.openxmlformats.org/officeDocument/2006/customXml" ds:itemID="{F7DFAA24-14DB-429E-BA63-6074C77E9DEC}">
   <ds:schemaRefs>
     <ds:schemaRef ds:uri="http://schemas.openxmlformats.org/officeDocument/2006/bibliography"/>
   </ds:schemaRefs>

</xml_diff>

<commit_message>
Forgot to update contents
</commit_message>
<xml_diff>
--- a/Analysis.docx
+++ b/Analysis.docx
@@ -154,7 +154,7 @@
           <w:r>
             <w:fldChar w:fldCharType="separate"/>
           </w:r>
-          <w:hyperlink w:anchor="_Toc124869867" w:history="1">
+          <w:hyperlink w:anchor="_Toc124875732" w:history="1">
             <w:r>
               <w:rPr>
                 <w:rStyle w:val="Hyperlink"/>
@@ -181,7 +181,7 @@
                 <w:noProof/>
                 <w:webHidden/>
               </w:rPr>
-              <w:instrText xml:space="preserve"> PAGEREF _Toc124869867 \h </w:instrText>
+              <w:instrText xml:space="preserve"> PAGEREF _Toc124875732 \h </w:instrText>
             </w:r>
             <w:r>
               <w:rPr>
@@ -225,7 +225,7 @@
               <w:lang w:eastAsia="en-GB"/>
             </w:rPr>
           </w:pPr>
-          <w:hyperlink w:anchor="_Toc124869868" w:history="1">
+          <w:hyperlink w:anchor="_Toc124875733" w:history="1">
             <w:r>
               <w:rPr>
                 <w:rStyle w:val="Hyperlink"/>
@@ -252,7 +252,7 @@
                 <w:noProof/>
                 <w:webHidden/>
               </w:rPr>
-              <w:instrText xml:space="preserve"> PAGEREF _Toc124869868 \h </w:instrText>
+              <w:instrText xml:space="preserve"> PAGEREF _Toc124875733 \h </w:instrText>
             </w:r>
             <w:r>
               <w:rPr>
@@ -296,7 +296,7 @@
               <w:lang w:eastAsia="en-GB"/>
             </w:rPr>
           </w:pPr>
-          <w:hyperlink w:anchor="_Toc124869869" w:history="1">
+          <w:hyperlink w:anchor="_Toc124875734" w:history="1">
             <w:r>
               <w:rPr>
                 <w:rStyle w:val="Hyperlink"/>
@@ -323,7 +323,7 @@
                 <w:noProof/>
                 <w:webHidden/>
               </w:rPr>
-              <w:instrText xml:space="preserve"> PAGEREF _Toc124869869 \h </w:instrText>
+              <w:instrText xml:space="preserve"> PAGEREF _Toc124875734 \h </w:instrText>
             </w:r>
             <w:r>
               <w:rPr>
@@ -367,7 +367,7 @@
               <w:lang w:eastAsia="en-GB"/>
             </w:rPr>
           </w:pPr>
-          <w:hyperlink w:anchor="_Toc124869870" w:history="1">
+          <w:hyperlink w:anchor="_Toc124875735" w:history="1">
             <w:r>
               <w:rPr>
                 <w:rStyle w:val="Hyperlink"/>
@@ -394,7 +394,7 @@
                 <w:noProof/>
                 <w:webHidden/>
               </w:rPr>
-              <w:instrText xml:space="preserve"> PAGEREF _Toc124869870 \h </w:instrText>
+              <w:instrText xml:space="preserve"> PAGEREF _Toc124875735 \h </w:instrText>
             </w:r>
             <w:r>
               <w:rPr>
@@ -438,7 +438,7 @@
               <w:lang w:eastAsia="en-GB"/>
             </w:rPr>
           </w:pPr>
-          <w:hyperlink w:anchor="_Toc124869871" w:history="1">
+          <w:hyperlink w:anchor="_Toc124875736" w:history="1">
             <w:r>
               <w:rPr>
                 <w:rStyle w:val="Hyperlink"/>
@@ -465,7 +465,7 @@
                 <w:noProof/>
                 <w:webHidden/>
               </w:rPr>
-              <w:instrText xml:space="preserve"> PAGEREF _Toc124869871 \h </w:instrText>
+              <w:instrText xml:space="preserve"> PAGEREF _Toc124875736 \h </w:instrText>
             </w:r>
             <w:r>
               <w:rPr>
@@ -509,7 +509,7 @@
               <w:lang w:eastAsia="en-GB"/>
             </w:rPr>
           </w:pPr>
-          <w:hyperlink w:anchor="_Toc124869872" w:history="1">
+          <w:hyperlink w:anchor="_Toc124875737" w:history="1">
             <w:r>
               <w:rPr>
                 <w:rStyle w:val="Hyperlink"/>
@@ -536,7 +536,7 @@
                 <w:noProof/>
                 <w:webHidden/>
               </w:rPr>
-              <w:instrText xml:space="preserve"> PAGEREF _Toc124869872 \h </w:instrText>
+              <w:instrText xml:space="preserve"> PAGEREF _Toc124875737 \h </w:instrText>
             </w:r>
             <w:r>
               <w:rPr>
@@ -580,7 +580,7 @@
               <w:lang w:eastAsia="en-GB"/>
             </w:rPr>
           </w:pPr>
-          <w:hyperlink w:anchor="_Toc124869873" w:history="1">
+          <w:hyperlink w:anchor="_Toc124875738" w:history="1">
             <w:r>
               <w:rPr>
                 <w:rStyle w:val="Hyperlink"/>
@@ -607,7 +607,7 @@
                 <w:noProof/>
                 <w:webHidden/>
               </w:rPr>
-              <w:instrText xml:space="preserve"> PAGEREF _Toc124869873 \h </w:instrText>
+              <w:instrText xml:space="preserve"> PAGEREF _Toc124875738 \h </w:instrText>
             </w:r>
             <w:r>
               <w:rPr>
@@ -651,7 +651,7 @@
               <w:lang w:eastAsia="en-GB"/>
             </w:rPr>
           </w:pPr>
-          <w:hyperlink w:anchor="_Toc124869874" w:history="1">
+          <w:hyperlink w:anchor="_Toc124875739" w:history="1">
             <w:r>
               <w:rPr>
                 <w:rStyle w:val="Hyperlink"/>
@@ -678,7 +678,7 @@
                 <w:noProof/>
                 <w:webHidden/>
               </w:rPr>
-              <w:instrText xml:space="preserve"> PAGEREF _Toc124869874 \h </w:instrText>
+              <w:instrText xml:space="preserve"> PAGEREF _Toc124875739 \h </w:instrText>
             </w:r>
             <w:r>
               <w:rPr>
@@ -722,7 +722,7 @@
               <w:lang w:eastAsia="en-GB"/>
             </w:rPr>
           </w:pPr>
-          <w:hyperlink w:anchor="_Toc124869875" w:history="1">
+          <w:hyperlink w:anchor="_Toc124875740" w:history="1">
             <w:r>
               <w:rPr>
                 <w:rStyle w:val="Hyperlink"/>
@@ -749,7 +749,7 @@
                 <w:noProof/>
                 <w:webHidden/>
               </w:rPr>
-              <w:instrText xml:space="preserve"> PAGEREF _Toc124869875 \h </w:instrText>
+              <w:instrText xml:space="preserve"> PAGEREF _Toc124875740 \h </w:instrText>
             </w:r>
             <w:r>
               <w:rPr>
@@ -793,7 +793,7 @@
               <w:lang w:eastAsia="en-GB"/>
             </w:rPr>
           </w:pPr>
-          <w:hyperlink w:anchor="_Toc124869876" w:history="1">
+          <w:hyperlink w:anchor="_Toc124875741" w:history="1">
             <w:r>
               <w:rPr>
                 <w:rStyle w:val="Hyperlink"/>
@@ -820,7 +820,7 @@
                 <w:noProof/>
                 <w:webHidden/>
               </w:rPr>
-              <w:instrText xml:space="preserve"> PAGEREF _Toc124869876 \h </w:instrText>
+              <w:instrText xml:space="preserve"> PAGEREF _Toc124875741 \h </w:instrText>
             </w:r>
             <w:r>
               <w:rPr>
@@ -864,7 +864,7 @@
               <w:lang w:eastAsia="en-GB"/>
             </w:rPr>
           </w:pPr>
-          <w:hyperlink w:anchor="_Toc124869877" w:history="1">
+          <w:hyperlink w:anchor="_Toc124875742" w:history="1">
             <w:r>
               <w:rPr>
                 <w:rStyle w:val="Hyperlink"/>
@@ -891,7 +891,7 @@
                 <w:noProof/>
                 <w:webHidden/>
               </w:rPr>
-              <w:instrText xml:space="preserve"> PAGEREF _Toc124869877 \h </w:instrText>
+              <w:instrText xml:space="preserve"> PAGEREF _Toc124875742 \h </w:instrText>
             </w:r>
             <w:r>
               <w:rPr>
@@ -935,7 +935,7 @@
               <w:lang w:eastAsia="en-GB"/>
             </w:rPr>
           </w:pPr>
-          <w:hyperlink w:anchor="_Toc124869878" w:history="1">
+          <w:hyperlink w:anchor="_Toc124875743" w:history="1">
             <w:r>
               <w:rPr>
                 <w:rStyle w:val="Hyperlink"/>
@@ -962,7 +962,7 @@
                 <w:noProof/>
                 <w:webHidden/>
               </w:rPr>
-              <w:instrText xml:space="preserve"> PAGEREF _Toc124869878 \h </w:instrText>
+              <w:instrText xml:space="preserve"> PAGEREF _Toc124875743 \h </w:instrText>
             </w:r>
             <w:r>
               <w:rPr>
@@ -983,6 +983,645 @@
                 <w:webHidden/>
               </w:rPr>
               <w:t>7</w:t>
+            </w:r>
+            <w:r>
+              <w:rPr>
+                <w:noProof/>
+                <w:webHidden/>
+              </w:rPr>
+              <w:fldChar w:fldCharType="end"/>
+            </w:r>
+          </w:hyperlink>
+        </w:p>
+        <w:p>
+          <w:pPr>
+            <w:pStyle w:val="TOC2"/>
+            <w:tabs>
+              <w:tab w:val="right" w:leader="dot" w:pos="9016"/>
+            </w:tabs>
+            <w:rPr>
+              <w:rFonts w:eastAsiaTheme="minorEastAsia"/>
+              <w:noProof/>
+              <w:sz w:val="22"/>
+              <w:lang w:eastAsia="en-GB"/>
+            </w:rPr>
+          </w:pPr>
+          <w:hyperlink w:anchor="_Toc124875744" w:history="1">
+            <w:r>
+              <w:rPr>
+                <w:rStyle w:val="Hyperlink"/>
+                <w:noProof/>
+              </w:rPr>
+              <w:t>Question 7: Would you like to be provided with a final score at the end of the game?</w:t>
+            </w:r>
+            <w:r>
+              <w:rPr>
+                <w:noProof/>
+                <w:webHidden/>
+              </w:rPr>
+              <w:tab/>
+            </w:r>
+            <w:r>
+              <w:rPr>
+                <w:noProof/>
+                <w:webHidden/>
+              </w:rPr>
+              <w:fldChar w:fldCharType="begin"/>
+            </w:r>
+            <w:r>
+              <w:rPr>
+                <w:noProof/>
+                <w:webHidden/>
+              </w:rPr>
+              <w:instrText xml:space="preserve"> PAGEREF _Toc124875744 \h </w:instrText>
+            </w:r>
+            <w:r>
+              <w:rPr>
+                <w:noProof/>
+                <w:webHidden/>
+              </w:rPr>
+            </w:r>
+            <w:r>
+              <w:rPr>
+                <w:noProof/>
+                <w:webHidden/>
+              </w:rPr>
+              <w:fldChar w:fldCharType="separate"/>
+            </w:r>
+            <w:r>
+              <w:rPr>
+                <w:noProof/>
+                <w:webHidden/>
+              </w:rPr>
+              <w:t>8</w:t>
+            </w:r>
+            <w:r>
+              <w:rPr>
+                <w:noProof/>
+                <w:webHidden/>
+              </w:rPr>
+              <w:fldChar w:fldCharType="end"/>
+            </w:r>
+          </w:hyperlink>
+        </w:p>
+        <w:p>
+          <w:pPr>
+            <w:pStyle w:val="TOC2"/>
+            <w:tabs>
+              <w:tab w:val="right" w:leader="dot" w:pos="9016"/>
+            </w:tabs>
+            <w:rPr>
+              <w:rFonts w:eastAsiaTheme="minorEastAsia"/>
+              <w:noProof/>
+              <w:sz w:val="22"/>
+              <w:lang w:eastAsia="en-GB"/>
+            </w:rPr>
+          </w:pPr>
+          <w:hyperlink w:anchor="_Toc124875745" w:history="1">
+            <w:r>
+              <w:rPr>
+                <w:rStyle w:val="Hyperlink"/>
+                <w:noProof/>
+              </w:rPr>
+              <w:t>Question 8: Would you like an online leaderboard?</w:t>
+            </w:r>
+            <w:r>
+              <w:rPr>
+                <w:noProof/>
+                <w:webHidden/>
+              </w:rPr>
+              <w:tab/>
+            </w:r>
+            <w:r>
+              <w:rPr>
+                <w:noProof/>
+                <w:webHidden/>
+              </w:rPr>
+              <w:fldChar w:fldCharType="begin"/>
+            </w:r>
+            <w:r>
+              <w:rPr>
+                <w:noProof/>
+                <w:webHidden/>
+              </w:rPr>
+              <w:instrText xml:space="preserve"> PAGEREF _Toc124875745 \h </w:instrText>
+            </w:r>
+            <w:r>
+              <w:rPr>
+                <w:noProof/>
+                <w:webHidden/>
+              </w:rPr>
+            </w:r>
+            <w:r>
+              <w:rPr>
+                <w:noProof/>
+                <w:webHidden/>
+              </w:rPr>
+              <w:fldChar w:fldCharType="separate"/>
+            </w:r>
+            <w:r>
+              <w:rPr>
+                <w:noProof/>
+                <w:webHidden/>
+              </w:rPr>
+              <w:t>8</w:t>
+            </w:r>
+            <w:r>
+              <w:rPr>
+                <w:noProof/>
+                <w:webHidden/>
+              </w:rPr>
+              <w:fldChar w:fldCharType="end"/>
+            </w:r>
+          </w:hyperlink>
+        </w:p>
+        <w:p>
+          <w:pPr>
+            <w:pStyle w:val="TOC2"/>
+            <w:tabs>
+              <w:tab w:val="right" w:leader="dot" w:pos="9016"/>
+            </w:tabs>
+            <w:rPr>
+              <w:rFonts w:eastAsiaTheme="minorEastAsia"/>
+              <w:noProof/>
+              <w:sz w:val="22"/>
+              <w:lang w:eastAsia="en-GB"/>
+            </w:rPr>
+          </w:pPr>
+          <w:hyperlink w:anchor="_Toc124875746" w:history="1">
+            <w:r>
+              <w:rPr>
+                <w:rStyle w:val="Hyperlink"/>
+                <w:noProof/>
+              </w:rPr>
+              <w:t>Question 9: What filtering options would you like on an online leaderboard?</w:t>
+            </w:r>
+            <w:r>
+              <w:rPr>
+                <w:noProof/>
+                <w:webHidden/>
+              </w:rPr>
+              <w:tab/>
+            </w:r>
+            <w:r>
+              <w:rPr>
+                <w:noProof/>
+                <w:webHidden/>
+              </w:rPr>
+              <w:fldChar w:fldCharType="begin"/>
+            </w:r>
+            <w:r>
+              <w:rPr>
+                <w:noProof/>
+                <w:webHidden/>
+              </w:rPr>
+              <w:instrText xml:space="preserve"> PAGEREF _Toc124875746 \h </w:instrText>
+            </w:r>
+            <w:r>
+              <w:rPr>
+                <w:noProof/>
+                <w:webHidden/>
+              </w:rPr>
+            </w:r>
+            <w:r>
+              <w:rPr>
+                <w:noProof/>
+                <w:webHidden/>
+              </w:rPr>
+              <w:fldChar w:fldCharType="separate"/>
+            </w:r>
+            <w:r>
+              <w:rPr>
+                <w:noProof/>
+                <w:webHidden/>
+              </w:rPr>
+              <w:t>9</w:t>
+            </w:r>
+            <w:r>
+              <w:rPr>
+                <w:noProof/>
+                <w:webHidden/>
+              </w:rPr>
+              <w:fldChar w:fldCharType="end"/>
+            </w:r>
+          </w:hyperlink>
+        </w:p>
+        <w:p>
+          <w:pPr>
+            <w:pStyle w:val="TOC2"/>
+            <w:tabs>
+              <w:tab w:val="right" w:leader="dot" w:pos="9016"/>
+            </w:tabs>
+            <w:rPr>
+              <w:rFonts w:eastAsiaTheme="minorEastAsia"/>
+              <w:noProof/>
+              <w:sz w:val="22"/>
+              <w:lang w:eastAsia="en-GB"/>
+            </w:rPr>
+          </w:pPr>
+          <w:hyperlink w:anchor="_Toc124875747" w:history="1">
+            <w:r>
+              <w:rPr>
+                <w:rStyle w:val="Hyperlink"/>
+                <w:noProof/>
+              </w:rPr>
+              <w:t>Question 10: Would you use a learning mode?</w:t>
+            </w:r>
+            <w:r>
+              <w:rPr>
+                <w:noProof/>
+                <w:webHidden/>
+              </w:rPr>
+              <w:tab/>
+            </w:r>
+            <w:r>
+              <w:rPr>
+                <w:noProof/>
+                <w:webHidden/>
+              </w:rPr>
+              <w:fldChar w:fldCharType="begin"/>
+            </w:r>
+            <w:r>
+              <w:rPr>
+                <w:noProof/>
+                <w:webHidden/>
+              </w:rPr>
+              <w:instrText xml:space="preserve"> PAGEREF _Toc124875747 \h </w:instrText>
+            </w:r>
+            <w:r>
+              <w:rPr>
+                <w:noProof/>
+                <w:webHidden/>
+              </w:rPr>
+            </w:r>
+            <w:r>
+              <w:rPr>
+                <w:noProof/>
+                <w:webHidden/>
+              </w:rPr>
+              <w:fldChar w:fldCharType="separate"/>
+            </w:r>
+            <w:r>
+              <w:rPr>
+                <w:noProof/>
+                <w:webHidden/>
+              </w:rPr>
+              <w:t>9</w:t>
+            </w:r>
+            <w:r>
+              <w:rPr>
+                <w:noProof/>
+                <w:webHidden/>
+              </w:rPr>
+              <w:fldChar w:fldCharType="end"/>
+            </w:r>
+          </w:hyperlink>
+        </w:p>
+        <w:p>
+          <w:pPr>
+            <w:pStyle w:val="TOC2"/>
+            <w:tabs>
+              <w:tab w:val="right" w:leader="dot" w:pos="9016"/>
+            </w:tabs>
+            <w:rPr>
+              <w:rFonts w:eastAsiaTheme="minorEastAsia"/>
+              <w:noProof/>
+              <w:sz w:val="22"/>
+              <w:lang w:eastAsia="en-GB"/>
+            </w:rPr>
+          </w:pPr>
+          <w:hyperlink w:anchor="_Toc124875748" w:history="1">
+            <w:r>
+              <w:rPr>
+                <w:rStyle w:val="Hyperlink"/>
+                <w:noProof/>
+              </w:rPr>
+              <w:t>Question 11: Would you use a zen mode?</w:t>
+            </w:r>
+            <w:r>
+              <w:rPr>
+                <w:noProof/>
+                <w:webHidden/>
+              </w:rPr>
+              <w:tab/>
+            </w:r>
+            <w:r>
+              <w:rPr>
+                <w:noProof/>
+                <w:webHidden/>
+              </w:rPr>
+              <w:fldChar w:fldCharType="begin"/>
+            </w:r>
+            <w:r>
+              <w:rPr>
+                <w:noProof/>
+                <w:webHidden/>
+              </w:rPr>
+              <w:instrText xml:space="preserve"> PAGEREF _Toc124875748 \h </w:instrText>
+            </w:r>
+            <w:r>
+              <w:rPr>
+                <w:noProof/>
+                <w:webHidden/>
+              </w:rPr>
+            </w:r>
+            <w:r>
+              <w:rPr>
+                <w:noProof/>
+                <w:webHidden/>
+              </w:rPr>
+              <w:fldChar w:fldCharType="separate"/>
+            </w:r>
+            <w:r>
+              <w:rPr>
+                <w:noProof/>
+                <w:webHidden/>
+              </w:rPr>
+              <w:t>10</w:t>
+            </w:r>
+            <w:r>
+              <w:rPr>
+                <w:noProof/>
+                <w:webHidden/>
+              </w:rPr>
+              <w:fldChar w:fldCharType="end"/>
+            </w:r>
+          </w:hyperlink>
+        </w:p>
+        <w:p>
+          <w:pPr>
+            <w:pStyle w:val="TOC2"/>
+            <w:tabs>
+              <w:tab w:val="right" w:leader="dot" w:pos="9016"/>
+            </w:tabs>
+            <w:rPr>
+              <w:rFonts w:eastAsiaTheme="minorEastAsia"/>
+              <w:noProof/>
+              <w:sz w:val="22"/>
+              <w:lang w:eastAsia="en-GB"/>
+            </w:rPr>
+          </w:pPr>
+          <w:hyperlink w:anchor="_Toc124875749" w:history="1">
+            <w:r>
+              <w:rPr>
+                <w:rStyle w:val="Hyperlink"/>
+                <w:noProof/>
+              </w:rPr>
+              <w:t>Question 12: Do you prefer fast or slow-paced games?</w:t>
+            </w:r>
+            <w:r>
+              <w:rPr>
+                <w:noProof/>
+                <w:webHidden/>
+              </w:rPr>
+              <w:tab/>
+            </w:r>
+            <w:r>
+              <w:rPr>
+                <w:noProof/>
+                <w:webHidden/>
+              </w:rPr>
+              <w:fldChar w:fldCharType="begin"/>
+            </w:r>
+            <w:r>
+              <w:rPr>
+                <w:noProof/>
+                <w:webHidden/>
+              </w:rPr>
+              <w:instrText xml:space="preserve"> PAGEREF _Toc124875749 \h </w:instrText>
+            </w:r>
+            <w:r>
+              <w:rPr>
+                <w:noProof/>
+                <w:webHidden/>
+              </w:rPr>
+            </w:r>
+            <w:r>
+              <w:rPr>
+                <w:noProof/>
+                <w:webHidden/>
+              </w:rPr>
+              <w:fldChar w:fldCharType="separate"/>
+            </w:r>
+            <w:r>
+              <w:rPr>
+                <w:noProof/>
+                <w:webHidden/>
+              </w:rPr>
+              <w:t>10</w:t>
+            </w:r>
+            <w:r>
+              <w:rPr>
+                <w:noProof/>
+                <w:webHidden/>
+              </w:rPr>
+              <w:fldChar w:fldCharType="end"/>
+            </w:r>
+          </w:hyperlink>
+        </w:p>
+        <w:p>
+          <w:pPr>
+            <w:pStyle w:val="TOC2"/>
+            <w:tabs>
+              <w:tab w:val="right" w:leader="dot" w:pos="9016"/>
+            </w:tabs>
+            <w:rPr>
+              <w:rFonts w:eastAsiaTheme="minorEastAsia"/>
+              <w:noProof/>
+              <w:sz w:val="22"/>
+              <w:lang w:eastAsia="en-GB"/>
+            </w:rPr>
+          </w:pPr>
+          <w:hyperlink w:anchor="_Toc124875750" w:history="1">
+            <w:r>
+              <w:rPr>
+                <w:rStyle w:val="Hyperlink"/>
+                <w:noProof/>
+              </w:rPr>
+              <w:t>Question 13: What control scheme would you prefer?</w:t>
+            </w:r>
+            <w:r>
+              <w:rPr>
+                <w:noProof/>
+                <w:webHidden/>
+              </w:rPr>
+              <w:tab/>
+            </w:r>
+            <w:r>
+              <w:rPr>
+                <w:noProof/>
+                <w:webHidden/>
+              </w:rPr>
+              <w:fldChar w:fldCharType="begin"/>
+            </w:r>
+            <w:r>
+              <w:rPr>
+                <w:noProof/>
+                <w:webHidden/>
+              </w:rPr>
+              <w:instrText xml:space="preserve"> PAGEREF _Toc124875750 \h </w:instrText>
+            </w:r>
+            <w:r>
+              <w:rPr>
+                <w:noProof/>
+                <w:webHidden/>
+              </w:rPr>
+            </w:r>
+            <w:r>
+              <w:rPr>
+                <w:noProof/>
+                <w:webHidden/>
+              </w:rPr>
+              <w:fldChar w:fldCharType="separate"/>
+            </w:r>
+            <w:r>
+              <w:rPr>
+                <w:noProof/>
+                <w:webHidden/>
+              </w:rPr>
+              <w:t>11</w:t>
+            </w:r>
+            <w:r>
+              <w:rPr>
+                <w:noProof/>
+                <w:webHidden/>
+              </w:rPr>
+              <w:fldChar w:fldCharType="end"/>
+            </w:r>
+          </w:hyperlink>
+        </w:p>
+        <w:p>
+          <w:pPr>
+            <w:pStyle w:val="TOC2"/>
+            <w:tabs>
+              <w:tab w:val="right" w:leader="dot" w:pos="9016"/>
+            </w:tabs>
+            <w:rPr>
+              <w:rFonts w:eastAsiaTheme="minorEastAsia"/>
+              <w:noProof/>
+              <w:sz w:val="22"/>
+              <w:lang w:eastAsia="en-GB"/>
+            </w:rPr>
+          </w:pPr>
+          <w:hyperlink w:anchor="_Toc124875751" w:history="1">
+            <w:r>
+              <w:rPr>
+                <w:rStyle w:val="Hyperlink"/>
+                <w:noProof/>
+              </w:rPr>
+              <w:t>Question 14: How many minutes should the average game last?</w:t>
+            </w:r>
+            <w:r>
+              <w:rPr>
+                <w:noProof/>
+                <w:webHidden/>
+              </w:rPr>
+              <w:tab/>
+            </w:r>
+            <w:r>
+              <w:rPr>
+                <w:noProof/>
+                <w:webHidden/>
+              </w:rPr>
+              <w:fldChar w:fldCharType="begin"/>
+            </w:r>
+            <w:r>
+              <w:rPr>
+                <w:noProof/>
+                <w:webHidden/>
+              </w:rPr>
+              <w:instrText xml:space="preserve"> PAGEREF _Toc124875751 \h </w:instrText>
+            </w:r>
+            <w:r>
+              <w:rPr>
+                <w:noProof/>
+                <w:webHidden/>
+              </w:rPr>
+            </w:r>
+            <w:r>
+              <w:rPr>
+                <w:noProof/>
+                <w:webHidden/>
+              </w:rPr>
+              <w:fldChar w:fldCharType="separate"/>
+            </w:r>
+            <w:r>
+              <w:rPr>
+                <w:noProof/>
+                <w:webHidden/>
+              </w:rPr>
+              <w:t>11</w:t>
+            </w:r>
+            <w:r>
+              <w:rPr>
+                <w:noProof/>
+                <w:webHidden/>
+              </w:rPr>
+              <w:fldChar w:fldCharType="end"/>
+            </w:r>
+          </w:hyperlink>
+        </w:p>
+        <w:p>
+          <w:pPr>
+            <w:pStyle w:val="TOC2"/>
+            <w:tabs>
+              <w:tab w:val="right" w:leader="dot" w:pos="9016"/>
+            </w:tabs>
+            <w:rPr>
+              <w:rFonts w:eastAsiaTheme="minorEastAsia"/>
+              <w:noProof/>
+              <w:sz w:val="22"/>
+              <w:lang w:eastAsia="en-GB"/>
+            </w:rPr>
+          </w:pPr>
+          <w:hyperlink w:anchor="_Toc124875752" w:history="1">
+            <w:r>
+              <w:rPr>
+                <w:rStyle w:val="Hyperlink"/>
+                <w:noProof/>
+              </w:rPr>
+              <w:t>Question 15: Any other comments?</w:t>
+            </w:r>
+            <w:r>
+              <w:rPr>
+                <w:noProof/>
+                <w:webHidden/>
+              </w:rPr>
+              <w:tab/>
+            </w:r>
+            <w:r>
+              <w:rPr>
+                <w:noProof/>
+                <w:webHidden/>
+              </w:rPr>
+              <w:fldChar w:fldCharType="begin"/>
+            </w:r>
+            <w:r>
+              <w:rPr>
+                <w:noProof/>
+                <w:webHidden/>
+              </w:rPr>
+              <w:instrText xml:space="preserve"> PAGEREF _Toc124875752 \h </w:instrText>
+            </w:r>
+            <w:r>
+              <w:rPr>
+                <w:noProof/>
+                <w:webHidden/>
+              </w:rPr>
+            </w:r>
+            <w:r>
+              <w:rPr>
+                <w:noProof/>
+                <w:webHidden/>
+              </w:rPr>
+              <w:fldChar w:fldCharType="separate"/>
+            </w:r>
+            <w:r>
+              <w:rPr>
+                <w:noProof/>
+                <w:webHidden/>
+              </w:rPr>
+              <w:t>11</w:t>
             </w:r>
             <w:r>
               <w:rPr>
@@ -1022,7 +1661,7 @@
       <w:pPr>
         <w:pStyle w:val="Heading1"/>
       </w:pPr>
-      <w:bookmarkStart w:id="0" w:name="_Toc124869867"/>
+      <w:bookmarkStart w:id="0" w:name="_Toc124875732"/>
       <w:r>
         <w:lastRenderedPageBreak/>
         <w:t>Introduction</w:t>
@@ -1168,7 +1807,7 @@
       <w:pPr>
         <w:pStyle w:val="Heading1"/>
       </w:pPr>
-      <w:bookmarkStart w:id="1" w:name="_Toc124869868"/>
+      <w:bookmarkStart w:id="1" w:name="_Toc124875733"/>
       <w:r>
         <w:t>Existing Solutions</w:t>
       </w:r>
@@ -1183,7 +1822,7 @@
       <w:pPr>
         <w:pStyle w:val="Heading2"/>
       </w:pPr>
-      <w:bookmarkStart w:id="2" w:name="_Toc124869869"/>
+      <w:bookmarkStart w:id="2" w:name="_Toc124875734"/>
       <w:r>
         <w:t>BBC Bitesize</w:t>
       </w:r>
@@ -1232,7 +1871,7 @@
                     <pic:cNvPicPr/>
                   </pic:nvPicPr>
                   <pic:blipFill>
-                    <a:blip r:embed="rId9"/>
+                    <a:blip r:embed="rId8"/>
                     <a:stretch>
                       <a:fillRect/>
                     </a:stretch>
@@ -1295,7 +1934,7 @@
                     <pic:cNvPicPr/>
                   </pic:nvPicPr>
                   <pic:blipFill>
-                    <a:blip r:embed="rId10"/>
+                    <a:blip r:embed="rId9"/>
                     <a:stretch>
                       <a:fillRect/>
                     </a:stretch>
@@ -1387,7 +2026,7 @@
           <w:noProof/>
         </w:rPr>
       </w:pPr>
-      <w:bookmarkStart w:id="3" w:name="_Toc124869870"/>
+      <w:bookmarkStart w:id="3" w:name="_Toc124875735"/>
       <w:r>
         <w:rPr>
           <w:noProof/>
@@ -1455,7 +2094,7 @@
                     <pic:cNvPicPr/>
                   </pic:nvPicPr>
                   <pic:blipFill>
-                    <a:blip r:embed="rId11"/>
+                    <a:blip r:embed="rId10"/>
                     <a:stretch>
                       <a:fillRect/>
                     </a:stretch>
@@ -1531,7 +2170,7 @@
       <w:pPr>
         <w:pStyle w:val="Heading2"/>
       </w:pPr>
-      <w:bookmarkStart w:id="4" w:name="_Toc124869871"/>
+      <w:bookmarkStart w:id="4" w:name="_Toc124875736"/>
       <w:r>
         <w:t>Geeks for Geeks</w:t>
       </w:r>
@@ -1618,7 +2257,7 @@
                     <pic:cNvPicPr/>
                   </pic:nvPicPr>
                   <pic:blipFill>
-                    <a:blip r:embed="rId12"/>
+                    <a:blip r:embed="rId11"/>
                     <a:stretch>
                       <a:fillRect/>
                     </a:stretch>
@@ -1658,7 +2297,7 @@
       <w:pPr>
         <w:pStyle w:val="Heading1"/>
       </w:pPr>
-      <w:bookmarkStart w:id="5" w:name="_Toc124869872"/>
+      <w:bookmarkStart w:id="5" w:name="_Toc124875737"/>
       <w:r>
         <w:rPr>
           <w:noProof/>
@@ -1697,7 +2336,7 @@
                     <pic:cNvPicPr/>
                   </pic:nvPicPr>
                   <pic:blipFill>
-                    <a:blip r:embed="rId13"/>
+                    <a:blip r:embed="rId12"/>
                     <a:stretch>
                       <a:fillRect/>
                     </a:stretch>
@@ -1805,7 +2444,7 @@
       <w:pPr>
         <w:pStyle w:val="Heading2"/>
       </w:pPr>
-      <w:bookmarkStart w:id="6" w:name="_Toc124869873"/>
+      <w:bookmarkStart w:id="6" w:name="_Toc124875738"/>
       <w:r>
         <w:t>Question 1: What functions of the operating system can you remember right now?</w:t>
       </w:r>
@@ -1839,7 +2478,7 @@
       <w:pPr>
         <w:pStyle w:val="Heading2"/>
       </w:pPr>
-      <w:bookmarkStart w:id="7" w:name="_Toc124869874"/>
+      <w:bookmarkStart w:id="7" w:name="_Toc124875739"/>
       <w:r>
         <w:lastRenderedPageBreak/>
         <w:t>Question 2:</w:t>
@@ -1874,7 +2513,7 @@
                     <pic:cNvPicPr/>
                   </pic:nvPicPr>
                   <pic:blipFill>
-                    <a:blip r:embed="rId14"/>
+                    <a:blip r:embed="rId13"/>
                     <a:stretch>
                       <a:fillRect/>
                     </a:stretch>
@@ -1908,7 +2547,7 @@
       <w:pPr>
         <w:pStyle w:val="Heading2"/>
       </w:pPr>
-      <w:bookmarkStart w:id="8" w:name="_Toc124869875"/>
+      <w:bookmarkStart w:id="8" w:name="_Toc124875740"/>
       <w:r>
         <w:t xml:space="preserve">Question 3: </w:t>
       </w:r>
@@ -1935,19 +2574,7 @@
           <w:rPr>
             <w:rStyle w:val="Hyperlink"/>
           </w:rPr>
-          <w:t>Que</w:t>
-        </w:r>
-        <w:r>
-          <w:rPr>
-            <w:rStyle w:val="Hyperlink"/>
-          </w:rPr>
-          <w:t>s</w:t>
-        </w:r>
-        <w:r>
-          <w:rPr>
-            <w:rStyle w:val="Hyperlink"/>
-          </w:rPr>
-          <w:t>tion 10</w:t>
+          <w:t>Question 10</w:t>
         </w:r>
       </w:hyperlink>
       <w:r>
@@ -1983,7 +2610,7 @@
       <w:pPr>
         <w:pStyle w:val="Heading2"/>
       </w:pPr>
-      <w:bookmarkStart w:id="9" w:name="_Toc124869876"/>
+      <w:bookmarkStart w:id="9" w:name="_Toc124875741"/>
       <w:r>
         <w:t xml:space="preserve">Question 4: </w:t>
       </w:r>
@@ -2024,7 +2651,7 @@
       <w:pPr>
         <w:pStyle w:val="Heading2"/>
       </w:pPr>
-      <w:bookmarkStart w:id="10" w:name="_Toc124869877"/>
+      <w:bookmarkStart w:id="10" w:name="_Toc124875742"/>
       <w:r>
         <w:lastRenderedPageBreak/>
         <w:t xml:space="preserve">Question 5: </w:t>
@@ -2056,7 +2683,7 @@
                     <pic:cNvPicPr/>
                   </pic:nvPicPr>
                   <pic:blipFill rotWithShape="1">
-                    <a:blip r:embed="rId15"/>
+                    <a:blip r:embed="rId14"/>
                     <a:srcRect l="997"/>
                     <a:stretch/>
                   </pic:blipFill>
@@ -2125,19 +2752,22 @@
       <w:pPr>
         <w:pStyle w:val="Heading2"/>
       </w:pPr>
-      <w:bookmarkStart w:id="11" w:name="_Toc124869878"/>
-      <w:bookmarkStart w:id="12" w:name="_Question_6:_Would"/>
+      <w:bookmarkStart w:id="11" w:name="_Question_6:_Would"/>
+      <w:bookmarkStart w:id="12" w:name="_Toc124875743"/>
+      <w:bookmarkEnd w:id="11"/>
+      <w:r>
+        <w:t xml:space="preserve">Question 6: </w:t>
+      </w:r>
+      <w:r>
+        <w:t>Would you like the game to speed up as it goes on?</w:t>
+      </w:r>
       <w:bookmarkEnd w:id="12"/>
-      <w:r>
-        <w:t xml:space="preserve">Question 6: </w:t>
-      </w:r>
-      <w:r>
-        <w:t>Would you like the game to speed up as it goes on?</w:t>
-      </w:r>
-      <w:bookmarkEnd w:id="11"/>
-    </w:p>
-    <w:p>
-      <w:r>
+    </w:p>
+    <w:p>
+      <w:r>
+        <w:rPr>
+          <w:noProof/>
+        </w:rPr>
         <w:drawing>
           <wp:anchor distT="0" distB="0" distL="114300" distR="114300" simplePos="0" relativeHeight="251658245" behindDoc="0" locked="0" layoutInCell="1" allowOverlap="1" wp14:anchorId="3861BA68" wp14:editId="1169C71B">
             <wp:simplePos x="0" y="0"/>
@@ -2162,7 +2792,7 @@
                     <pic:cNvPicPr/>
                   </pic:nvPicPr>
                   <pic:blipFill rotWithShape="1">
-                    <a:blip r:embed="rId16">
+                    <a:blip r:embed="rId15">
                       <a:extLst>
                         <a:ext uri="{28A0092B-C50C-407E-A947-70E740481C1C}">
                           <a14:useLocalDpi xmlns:a14="http://schemas.microsoft.com/office/drawing/2010/main" val="0"/>
@@ -2236,6 +2866,7 @@
       <w:pPr>
         <w:pStyle w:val="Heading2"/>
       </w:pPr>
+      <w:bookmarkStart w:id="13" w:name="_Toc124875744"/>
       <w:r>
         <w:lastRenderedPageBreak/>
         <w:t xml:space="preserve">Question 7: </w:t>
@@ -2243,9 +2874,13 @@
       <w:r>
         <w:t>Would you like to be provided with a final score at the end of the game?</w:t>
       </w:r>
-    </w:p>
-    <w:p>
-      <w:r>
+      <w:bookmarkEnd w:id="13"/>
+    </w:p>
+    <w:p>
+      <w:r>
+        <w:rPr>
+          <w:noProof/>
+        </w:rPr>
         <w:drawing>
           <wp:anchor distT="0" distB="0" distL="114300" distR="114300" simplePos="0" relativeHeight="251662341" behindDoc="0" locked="0" layoutInCell="1" allowOverlap="1" wp14:anchorId="15916523" wp14:editId="7AB0E9FE">
             <wp:simplePos x="0" y="0"/>
@@ -2270,7 +2905,7 @@
                     <pic:cNvPicPr/>
                   </pic:nvPicPr>
                   <pic:blipFill>
-                    <a:blip r:embed="rId17"/>
+                    <a:blip r:embed="rId16"/>
                     <a:stretch>
                       <a:fillRect/>
                     </a:stretch>
@@ -2291,6 +2926,9 @@
         </w:drawing>
       </w:r>
       <w:r>
+        <w:rPr>
+          <w:noProof/>
+        </w:rPr>
         <w:drawing>
           <wp:anchor distT="0" distB="0" distL="114300" distR="114300" simplePos="0" relativeHeight="251660293" behindDoc="0" locked="0" layoutInCell="1" allowOverlap="1" wp14:anchorId="5D923468" wp14:editId="50B4B046">
             <wp:simplePos x="0" y="0"/>
@@ -2315,7 +2953,7 @@
                     <pic:cNvPicPr/>
                   </pic:nvPicPr>
                   <pic:blipFill>
-                    <a:blip r:embed="rId18"/>
+                    <a:blip r:embed="rId17"/>
                     <a:stretch>
                       <a:fillRect/>
                     </a:stretch>
@@ -2394,8 +3032,9 @@
       <w:pPr>
         <w:pStyle w:val="Heading2"/>
       </w:pPr>
-      <w:bookmarkStart w:id="13" w:name="_Question_8:_Would"/>
-      <w:bookmarkEnd w:id="13"/>
+      <w:bookmarkStart w:id="14" w:name="_Question_8:_Would"/>
+      <w:bookmarkStart w:id="15" w:name="_Toc124875745"/>
+      <w:bookmarkEnd w:id="14"/>
       <w:r>
         <w:t xml:space="preserve">Question 8: </w:t>
       </w:r>
@@ -2408,6 +3047,7 @@
       <w:r>
         <w:t>erboard?</w:t>
       </w:r>
+      <w:bookmarkEnd w:id="15"/>
     </w:p>
     <w:p>
       <w:r>
@@ -2436,7 +3076,11 @@
       <w:pPr>
         <w:pStyle w:val="Heading2"/>
       </w:pPr>
-      <w:r>
+      <w:bookmarkStart w:id="16" w:name="_Toc124875746"/>
+      <w:r>
+        <w:rPr>
+          <w:noProof/>
+        </w:rPr>
         <w:lastRenderedPageBreak/>
         <w:drawing>
           <wp:anchor distT="0" distB="0" distL="114300" distR="114300" simplePos="0" relativeHeight="251664389" behindDoc="0" locked="0" layoutInCell="1" allowOverlap="1" wp14:anchorId="476BD938" wp14:editId="7657031E">
@@ -2462,7 +3106,7 @@
                     <pic:cNvPicPr/>
                   </pic:nvPicPr>
                   <pic:blipFill>
-                    <a:blip r:embed="rId19"/>
+                    <a:blip r:embed="rId18"/>
                     <a:stretch>
                       <a:fillRect/>
                     </a:stretch>
@@ -2491,6 +3135,7 @@
       <w:r>
         <w:t>What filtering options would you like on an online leaderboard?</w:t>
       </w:r>
+      <w:bookmarkEnd w:id="16"/>
     </w:p>
     <w:p>
       <w:r>
@@ -2525,9 +3170,13 @@
       <w:pPr>
         <w:pStyle w:val="Heading2"/>
       </w:pPr>
-      <w:bookmarkStart w:id="14" w:name="_Question_10:_Would"/>
-      <w:bookmarkEnd w:id="14"/>
-      <w:r>
+      <w:bookmarkStart w:id="17" w:name="_Question_10:_Would"/>
+      <w:bookmarkStart w:id="18" w:name="_Toc124875747"/>
+      <w:bookmarkEnd w:id="17"/>
+      <w:r>
+        <w:rPr>
+          <w:noProof/>
+        </w:rPr>
         <w:drawing>
           <wp:anchor distT="0" distB="0" distL="114300" distR="114300" simplePos="0" relativeHeight="251666437" behindDoc="0" locked="0" layoutInCell="1" allowOverlap="1" wp14:anchorId="70F81776" wp14:editId="51C3DD1F">
             <wp:simplePos x="0" y="0"/>
@@ -2552,7 +3201,7 @@
                     <pic:cNvPicPr/>
                   </pic:nvPicPr>
                   <pic:blipFill>
-                    <a:blip r:embed="rId20"/>
+                    <a:blip r:embed="rId19"/>
                     <a:stretch>
                       <a:fillRect/>
                     </a:stretch>
@@ -2575,6 +3224,7 @@
       <w:r>
         <w:t>Question 10: Would you use a learning mode?</w:t>
       </w:r>
+      <w:bookmarkEnd w:id="18"/>
     </w:p>
     <w:p>
       <w:r>
@@ -2600,9 +3250,13 @@
       <w:pPr>
         <w:pStyle w:val="Heading2"/>
       </w:pPr>
-      <w:bookmarkStart w:id="15" w:name="_Question_11:_Would"/>
-      <w:bookmarkEnd w:id="15"/>
-      <w:r>
+      <w:bookmarkStart w:id="19" w:name="_Question_11:_Would"/>
+      <w:bookmarkStart w:id="20" w:name="_Toc124875748"/>
+      <w:bookmarkEnd w:id="19"/>
+      <w:r>
+        <w:rPr>
+          <w:noProof/>
+        </w:rPr>
         <w:lastRenderedPageBreak/>
         <w:drawing>
           <wp:anchor distT="0" distB="0" distL="114300" distR="114300" simplePos="0" relativeHeight="251668485" behindDoc="0" locked="0" layoutInCell="1" allowOverlap="1" wp14:anchorId="0F373910" wp14:editId="501186B5">
@@ -2628,7 +3282,7 @@
                     <pic:cNvPicPr/>
                   </pic:nvPicPr>
                   <pic:blipFill>
-                    <a:blip r:embed="rId21"/>
+                    <a:blip r:embed="rId20"/>
                     <a:stretch>
                       <a:fillRect/>
                     </a:stretch>
@@ -2654,6 +3308,7 @@
       <w:r>
         <w:t>Would you use a zen mode?</w:t>
       </w:r>
+      <w:bookmarkEnd w:id="20"/>
     </w:p>
     <w:p>
       <w:r>
@@ -2726,7 +3381,11 @@
       <w:pPr>
         <w:pStyle w:val="Heading2"/>
       </w:pPr>
-      <w:r>
+      <w:bookmarkStart w:id="21" w:name="_Toc124875749"/>
+      <w:r>
+        <w:rPr>
+          <w:noProof/>
+        </w:rPr>
         <w:drawing>
           <wp:anchor distT="0" distB="0" distL="114300" distR="114300" simplePos="0" relativeHeight="251670533" behindDoc="0" locked="0" layoutInCell="1" allowOverlap="1" wp14:anchorId="385D0DF2" wp14:editId="7D4A4FE8">
             <wp:simplePos x="0" y="0"/>
@@ -2751,7 +3410,7 @@
                     <pic:cNvPicPr/>
                   </pic:nvPicPr>
                   <pic:blipFill>
-                    <a:blip r:embed="rId22"/>
+                    <a:blip r:embed="rId21"/>
                     <a:stretch>
                       <a:fillRect/>
                     </a:stretch>
@@ -2777,6 +3436,7 @@
       <w:r>
         <w:t>Do you prefer fast or slow-paced games?</w:t>
       </w:r>
+      <w:bookmarkEnd w:id="21"/>
     </w:p>
     <w:p>
       <w:r>
@@ -2815,7 +3475,11 @@
       <w:pPr>
         <w:pStyle w:val="Heading2"/>
       </w:pPr>
-      <w:r>
+      <w:bookmarkStart w:id="22" w:name="_Toc124875750"/>
+      <w:r>
+        <w:rPr>
+          <w:noProof/>
+        </w:rPr>
         <w:lastRenderedPageBreak/>
         <w:drawing>
           <wp:anchor distT="0" distB="0" distL="114300" distR="114300" simplePos="0" relativeHeight="251672581" behindDoc="0" locked="0" layoutInCell="1" allowOverlap="1" wp14:anchorId="04959112" wp14:editId="50842CCD">
@@ -2841,7 +3505,7 @@
                     <pic:cNvPicPr/>
                   </pic:nvPicPr>
                   <pic:blipFill>
-                    <a:blip r:embed="rId23"/>
+                    <a:blip r:embed="rId22"/>
                     <a:stretch>
                       <a:fillRect/>
                     </a:stretch>
@@ -2867,6 +3531,7 @@
       <w:r>
         <w:t>What control scheme would you prefer?</w:t>
       </w:r>
+      <w:bookmarkEnd w:id="22"/>
     </w:p>
     <w:p>
       <w:r>
@@ -2910,12 +3575,14 @@
       <w:pPr>
         <w:pStyle w:val="Heading2"/>
       </w:pPr>
+      <w:bookmarkStart w:id="23" w:name="_Toc124875751"/>
       <w:r>
         <w:t>Question 14</w:t>
       </w:r>
       <w:r>
         <w:t>: How many minutes should the average game last?</w:t>
       </w:r>
+      <w:bookmarkEnd w:id="23"/>
       <w:r>
         <w:t xml:space="preserve"> </w:t>
       </w:r>
@@ -2949,9 +3616,11 @@
       <w:pPr>
         <w:pStyle w:val="Heading2"/>
       </w:pPr>
+      <w:bookmarkStart w:id="24" w:name="_Toc124875752"/>
       <w:r>
         <w:t>Question 15: Any other comments?</w:t>
       </w:r>
+      <w:bookmarkEnd w:id="24"/>
     </w:p>
     <w:p>
       <w:r>
@@ -2996,10 +3665,10 @@
       </w:r>
     </w:p>
     <w:sectPr>
-      <w:headerReference w:type="default" r:id="rId24"/>
-      <w:footerReference w:type="default" r:id="rId25"/>
-      <w:headerReference w:type="first" r:id="rId26"/>
-      <w:footerReference w:type="first" r:id="rId27"/>
+      <w:headerReference w:type="default" r:id="rId23"/>
+      <w:footerReference w:type="default" r:id="rId24"/>
+      <w:headerReference w:type="first" r:id="rId25"/>
+      <w:footerReference w:type="first" r:id="rId26"/>
       <w:pgSz w:w="11906" w:h="16838"/>
       <w:pgMar w:top="1440" w:right="1440" w:bottom="1440" w:left="1440" w:header="708" w:footer="708" w:gutter="0"/>
       <w:pgNumType w:start="1"/>
@@ -3246,10 +3915,6 @@
     </w:pPr>
   </w:p>
 </w:hdr>
-</file>
-
-<file path=word/numbering.xml><?xml version="1.0" encoding="utf-8"?>
-<w:numbering xmlns:wpc="http://schemas.microsoft.com/office/word/2010/wordprocessingCanvas" xmlns:cx="http://schemas.microsoft.com/office/drawing/2014/chartex" xmlns:cx1="http://schemas.microsoft.com/office/drawing/2015/9/8/chartex" xmlns:cx2="http://schemas.microsoft.com/office/drawing/2015/10/21/chartex" xmlns:cx3="http://schemas.microsoft.com/office/drawing/2016/5/9/chartex" xmlns:cx4="http://schemas.microsoft.com/office/drawing/2016/5/10/chartex" xmlns:cx5="http://schemas.microsoft.com/office/drawing/2016/5/11/chartex" xmlns:cx6="http://schemas.microsoft.com/office/drawing/2016/5/12/chartex" xmlns:cx7="http://schemas.microsoft.com/office/drawing/2016/5/13/chartex" xmlns:cx8="http://schemas.microsoft.com/office/drawing/2016/5/14/chartex" xmlns:mc="http://schemas.openxmlformats.org/markup-compatibility/2006" xmlns:aink="http://schemas.microsoft.com/office/drawing/2016/ink" xmlns:am3d="http://schemas.microsoft.com/office/drawing/2017/model3d" xmlns:o="urn:schemas-microsoft-com:office:office" xmlns:oel="http://schemas.microsoft.com/office/2019/extlst" xmlns:r="http://schemas.openxmlformats.org/officeDocument/2006/relationships" xmlns:m="http://schemas.openxmlformats.org/officeDocument/2006/math" xmlns:v="urn:schemas-microsoft-com:vml" xmlns:wp14="http://schemas.microsoft.com/office/word/2010/wordprocessingDrawing" xmlns:wp="http://schemas.openxmlformats.org/drawingml/2006/wordprocessingDrawing" xmlns:w10="urn:schemas-microsoft-com:office:word" xmlns:w="http://schemas.openxmlformats.org/wordprocessingml/2006/main" xmlns:w14="http://schemas.microsoft.com/office/word/2010/wordml" xmlns:w15="http://schemas.microsoft.com/office/word/2012/wordml" xmlns:w16cex="http://schemas.microsoft.com/office/word/2018/wordml/cex" xmlns:w16cid="http://schemas.microsoft.com/office/word/2016/wordml/cid" xmlns:w16="http://schemas.microsoft.com/office/word/2018/wordml" xmlns:w16sdtdh="http://schemas.microsoft.com/office/word/2020/wordml/sdtdatahash" xmlns:w16se="http://schemas.microsoft.com/office/word/2015/wordml/symex" xmlns:wpg="http://schemas.microsoft.com/office/word/2010/wordprocessingGroup" xmlns:wpi="http://schemas.microsoft.com/office/word/2010/wordprocessingInk" xmlns:wne="http://schemas.microsoft.com/office/word/2006/wordml" xmlns:wps="http://schemas.microsoft.com/office/word/2010/wordprocessingShape" mc:Ignorable="w14 w15 w16se w16cid w16 w16cex w16sdtdh wp14"/>
 </file>
 
 <file path=word/styles.xml><?xml version="1.0" encoding="utf-8"?>
@@ -3375,6 +4040,7 @@
     <w:lsdException w:name="HTML Sample" w:semiHidden="1" w:unhideWhenUsed="1"/>
     <w:lsdException w:name="HTML Typewriter" w:semiHidden="1" w:unhideWhenUsed="1"/>
     <w:lsdException w:name="HTML Variable" w:semiHidden="1" w:unhideWhenUsed="1"/>
+    <w:lsdException w:name="Normal Table" w:semiHidden="1" w:unhideWhenUsed="1"/>
     <w:lsdException w:name="annotation subject" w:semiHidden="1" w:unhideWhenUsed="1"/>
     <w:lsdException w:name="No List" w:semiHidden="1" w:unhideWhenUsed="1"/>
     <w:lsdException w:name="Outline List 1" w:semiHidden="1" w:unhideWhenUsed="1"/>
@@ -3417,8 +4083,11 @@
     <w:lsdException w:name="Table Contemporary" w:semiHidden="1" w:unhideWhenUsed="1"/>
     <w:lsdException w:name="Table Elegant" w:semiHidden="1" w:unhideWhenUsed="1"/>
     <w:lsdException w:name="Table Professional" w:semiHidden="1" w:unhideWhenUsed="1"/>
+    <w:lsdException w:name="Table Subtle 1" w:semiHidden="1" w:unhideWhenUsed="1"/>
     <w:lsdException w:name="Table Subtle 2" w:semiHidden="1" w:unhideWhenUsed="1"/>
     <w:lsdException w:name="Table Web 1" w:semiHidden="1" w:unhideWhenUsed="1"/>
+    <w:lsdException w:name="Table Web 2" w:semiHidden="1" w:unhideWhenUsed="1"/>
+    <w:lsdException w:name="Table Web 3" w:semiHidden="1" w:unhideWhenUsed="1"/>
     <w:lsdException w:name="Balloon Text" w:semiHidden="1" w:unhideWhenUsed="1"/>
     <w:lsdException w:name="Table Grid" w:uiPriority="39"/>
     <w:lsdException w:name="Table Theme" w:semiHidden="1" w:unhideWhenUsed="1"/>

</xml_diff>